<commit_message>
docs(data): refresh frontend testing review and prune legacy doc assets
- sync the generated review with the current /documents header, command bar, and AI briefing/status filter behavior
- update generate_docs.py and regenerate the markdown/docx review output
- remove older guide, workflow prompt, and brand/style support files
</commit_message>
<xml_diff>
--- a/FRONTEND_CLIENT_TESTING_REVIEW.docx
+++ b/FRONTEND_CLIENT_TESTING_REVIEW.docx
@@ -11028,7 +11028,7 @@
           <w:b w:val="0"/>
           <w:sz w:val="20"/>
         </w:rPr>
-        <w:t>Next to the title, an orange count pill shows '{N} files / {N} missing'.</w:t>
+        <w:t>Next to the title, an orange count pill shows '{N} files'. When there is at least one missing required document it extends to '{N} files / {N} missing'.</w:t>
       </w:r>
     </w:p>
     <w:p>
@@ -11068,7 +11068,7 @@
           <w:b w:val="0"/>
           <w:sz w:val="20"/>
         </w:rPr>
-        <w:t>'Upload Document' (or 'Upload' on a narrow screen) is always visible.</w:t>
+        <w:t>'Upload Document' (or just 'Upload' on a narrow screen) is always visible.</w:t>
       </w:r>
     </w:p>
     <w:p>
@@ -11088,7 +11088,7 @@
           <w:b w:val="0"/>
           <w:sz w:val="20"/>
         </w:rPr>
-        <w:t>'Send for Signature' is visible.</w:t>
+        <w:t>'Send for Signature' is visible (the label collapses to an icon on narrow screens).</w:t>
       </w:r>
     </w:p>
     <w:p>
@@ -11108,7 +11108,87 @@
           <w:b w:val="0"/>
           <w:sz w:val="20"/>
         </w:rPr>
-        <w:t>'Deletion Queue' is visible only when you are signed in as an internal role (Agent, Elf, Team Lead, Attorney, or Admin).</w:t>
+        <w:t>'Deletion Queue' is visible only on wide screens AND when you are signed in as an internal role (Agent, Elf, Team Lead, Attorney, or Admin).</w:t>
+      </w:r>
+    </w:p>
+    <w:p>
+      <w:pPr>
+        <w:spacing w:after="40"/>
+        <w:ind w:left="425" w:hanging="255"/>
+      </w:pPr>
+      <w:r>
+        <w:rPr>
+          <w:b w:val="0"/>
+          <w:sz w:val="20"/>
+        </w:rPr>
+        <w:t xml:space="preserve">-  </w:t>
+      </w:r>
+      <w:r>
+        <w:rPr>
+          <w:b w:val="0"/>
+          <w:sz w:val="20"/>
+        </w:rPr>
+        <w:t>Check the underline-style filter tabs directly below the title row.</w:t>
+      </w:r>
+    </w:p>
+    <w:p>
+      <w:pPr>
+        <w:spacing w:after="40"/>
+        <w:ind w:left="907" w:hanging="255"/>
+      </w:pPr>
+      <w:r>
+        <w:rPr>
+          <w:b w:val="0"/>
+          <w:sz w:val="20"/>
+        </w:rPr>
+        <w:t xml:space="preserve">•  </w:t>
+      </w:r>
+      <w:r>
+        <w:rPr>
+          <w:b w:val="0"/>
+          <w:sz w:val="20"/>
+        </w:rPr>
+        <w:t>Tabs: All, Signed, Pending Review, Sent for Sig., Missing — each shows a count badge.</w:t>
+      </w:r>
+    </w:p>
+    <w:p>
+      <w:pPr>
+        <w:spacing w:after="40"/>
+        <w:ind w:left="907" w:hanging="255"/>
+      </w:pPr>
+      <w:r>
+        <w:rPr>
+          <w:b w:val="0"/>
+          <w:sz w:val="20"/>
+        </w:rPr>
+        <w:t xml:space="preserve">•  </w:t>
+      </w:r>
+      <w:r>
+        <w:rPr>
+          <w:b w:val="0"/>
+          <w:sz w:val="20"/>
+        </w:rPr>
+        <w:t>The active tab is highlighted with an orange underline and orange text.</w:t>
+      </w:r>
+    </w:p>
+    <w:p>
+      <w:pPr>
+        <w:spacing w:after="40"/>
+        <w:ind w:left="907" w:hanging="255"/>
+      </w:pPr>
+      <w:r>
+        <w:rPr>
+          <w:b w:val="0"/>
+          <w:sz w:val="20"/>
+        </w:rPr>
+        <w:t xml:space="preserve">•  </w:t>
+      </w:r>
+      <w:r>
+        <w:rPr>
+          <w:b w:val="0"/>
+          <w:sz w:val="20"/>
+        </w:rPr>
+        <w:t>The 'Missing' badge turns red when the count is greater than zero.</w:t>
       </w:r>
     </w:p>
     <w:p>
@@ -11261,7 +11341,7 @@
           <w:b w:val="0"/>
           <w:sz w:val="20"/>
         </w:rPr>
-        <w:t>The title, count pill, and header buttons all render correctly for the signed-in role.</w:t>
+        <w:t>The title, count pill, filter tabs, and header buttons all render correctly for the signed-in role and screen size.</w:t>
       </w:r>
     </w:p>
     <w:p>
@@ -11482,7 +11562,7 @@
         <w:spacing w:after="80" w:before="280"/>
       </w:pPr>
       <w:r>
-        <w:t>27.1. All Documents — search, filter tabs, side filters, and view toggle</w:t>
+        <w:t>27.1. All Documents — unified command bar (search, side filters, view toggle)</w:t>
       </w:r>
     </w:p>
     <w:p>
@@ -11507,7 +11587,7 @@
           <w:b w:val="0"/>
           <w:sz w:val="20"/>
         </w:rPr>
-        <w:t>/documents (controls below the header)</w:t>
+        <w:t>/documents (Unified Command Bar — second tier, directly below the AI Briefing)</w:t>
       </w:r>
     </w:p>
     <w:p>
@@ -11540,7 +11620,27 @@
           <w:b w:val="0"/>
           <w:sz w:val="20"/>
         </w:rPr>
-        <w:t>Use the search box at the top of the content area.</w:t>
+        <w:t>Locate the Unified Command Bar. It is a single white card with two tiers — the bottom tier holds the controls described here (Tier 1 is covered in 27.2).</w:t>
+      </w:r>
+    </w:p>
+    <w:p>
+      <w:pPr>
+        <w:spacing w:after="40"/>
+        <w:ind w:left="425" w:hanging="255"/>
+      </w:pPr>
+      <w:r>
+        <w:rPr>
+          <w:b w:val="0"/>
+          <w:sz w:val="20"/>
+        </w:rPr>
+        <w:t xml:space="preserve">-  </w:t>
+      </w:r>
+      <w:r>
+        <w:rPr>
+          <w:b w:val="0"/>
+          <w:sz w:val="20"/>
+        </w:rPr>
+        <w:t>Use the search box on the left of Tier 2.</w:t>
       </w:r>
     </w:p>
     <w:p>
@@ -11600,6 +11700,26 @@
           <w:b w:val="0"/>
           <w:sz w:val="20"/>
         </w:rPr>
+        <w:t>Confirm the search field gains an orange focus ring when selected.</w:t>
+      </w:r>
+    </w:p>
+    <w:p>
+      <w:pPr>
+        <w:spacing w:after="40"/>
+        <w:ind w:left="907" w:hanging="255"/>
+      </w:pPr>
+      <w:r>
+        <w:rPr>
+          <w:b w:val="0"/>
+          <w:sz w:val="20"/>
+        </w:rPr>
+        <w:t xml:space="preserve">•  </w:t>
+      </w:r>
+      <w:r>
+        <w:rPr>
+          <w:b w:val="0"/>
+          <w:sz w:val="20"/>
+        </w:rPr>
         <w:t>Click the small 'x' inside the search box to clear it.</w:t>
       </w:r>
     </w:p>
@@ -11620,7 +11740,7 @@
           <w:b w:val="0"/>
           <w:sz w:val="20"/>
         </w:rPr>
-        <w:t>Use the filter tabs: All, Signed, Pending Review, Sent for Sig., Missing.</w:t>
+        <w:t>Use the side filter pills.</w:t>
       </w:r>
     </w:p>
     <w:p>
@@ -11640,7 +11760,7 @@
           <w:b w:val="0"/>
           <w:sz w:val="20"/>
         </w:rPr>
-        <w:t>Each tab shows a count badge.</w:t>
+        <w:t>Options: All, Buyer Side, Listing Side.</w:t>
       </w:r>
     </w:p>
     <w:p>
@@ -11660,7 +11780,7 @@
           <w:b w:val="0"/>
           <w:sz w:val="20"/>
         </w:rPr>
-        <w:t>Confirm the 'Missing' badge turns red when the count is greater than zero.</w:t>
+        <w:t>Each pill shows a transaction count.</w:t>
       </w:r>
     </w:p>
     <w:p>
@@ -11680,7 +11800,27 @@
           <w:b w:val="0"/>
           <w:sz w:val="20"/>
         </w:rPr>
-        <w:t>Click each tab and confirm the list below updates.</w:t>
+        <w:t>The active pill has an orange background and bold amber text.</w:t>
+      </w:r>
+    </w:p>
+    <w:p>
+      <w:pPr>
+        <w:spacing w:after="40"/>
+        <w:ind w:left="907" w:hanging="255"/>
+      </w:pPr>
+      <w:r>
+        <w:rPr>
+          <w:b w:val="0"/>
+          <w:sz w:val="20"/>
+        </w:rPr>
+        <w:t xml:space="preserve">•  </w:t>
+      </w:r>
+      <w:r>
+        <w:rPr>
+          <w:b w:val="0"/>
+          <w:sz w:val="20"/>
+        </w:rPr>
+        <w:t>On narrow screens the pills scroll horizontally rather than wrapping.</w:t>
       </w:r>
     </w:p>
     <w:p>
@@ -11700,7 +11840,7 @@
           <w:b w:val="0"/>
           <w:sz w:val="20"/>
         </w:rPr>
-        <w:t>Use the side filter pills.</w:t>
+        <w:t>Use the view toggle at the far right of the command bar.</w:t>
       </w:r>
     </w:p>
     <w:p>
@@ -11720,7 +11860,7 @@
           <w:b w:val="0"/>
           <w:sz w:val="20"/>
         </w:rPr>
-        <w:t>Options: All, Buyer Side, Listing Side.</w:t>
+        <w:t>Hover each toggle to see a tooltip: 'View grouped by transaction' or 'View grouped by status'.</w:t>
       </w:r>
     </w:p>
     <w:p>
@@ -11740,7 +11880,7 @@
           <w:b w:val="0"/>
           <w:sz w:val="20"/>
         </w:rPr>
-        <w:t>Each pill shows a transaction count.</w:t>
+        <w:t>On wide screens each toggle shows its icon plus the text 'By Transaction' / 'By Status'.</w:t>
       </w:r>
     </w:p>
     <w:p>
@@ -11760,7 +11900,27 @@
           <w:b w:val="0"/>
           <w:sz w:val="20"/>
         </w:rPr>
-        <w:t>The active pill has an orange background.</w:t>
+        <w:t>On narrow screens only the icons are visible (the text is hidden for accessibility but still read by screen readers).</w:t>
+      </w:r>
+    </w:p>
+    <w:p>
+      <w:pPr>
+        <w:spacing w:after="40"/>
+        <w:ind w:left="907" w:hanging="255"/>
+      </w:pPr>
+      <w:r>
+        <w:rPr>
+          <w:b w:val="0"/>
+          <w:sz w:val="20"/>
+        </w:rPr>
+        <w:t xml:space="preserve">•  </w:t>
+      </w:r>
+      <w:r>
+        <w:rPr>
+          <w:b w:val="0"/>
+          <w:sz w:val="20"/>
+        </w:rPr>
+        <w:t>The active toggle has an amber background and the inactive toggle is plain white.</w:t>
       </w:r>
     </w:p>
     <w:p>
@@ -11780,7 +11940,7 @@
           <w:b w:val="0"/>
           <w:sz w:val="20"/>
         </w:rPr>
-        <w:t>Use the view toggle at the top-right of the list.</w:t>
+        <w:t>Confirm the filter tabs in the page header still work together with these controls.</w:t>
       </w:r>
     </w:p>
     <w:p>
@@ -11800,7 +11960,7 @@
           <w:b w:val="0"/>
           <w:sz w:val="20"/>
         </w:rPr>
-        <w:t>'By Transaction' (shown as 'Txn' on a narrow screen) groups documents per transaction.</w:t>
+        <w:t>Header tabs: All, Signed, Pending Review, Sent for Sig., Missing.</w:t>
       </w:r>
     </w:p>
     <w:p>
@@ -11820,7 +11980,7 @@
           <w:b w:val="0"/>
           <w:sz w:val="20"/>
         </w:rPr>
-        <w:t>'By Status' (shown as 'Status' on a narrow screen) groups documents per signature status.</w:t>
+        <w:t>The header filter tabs and the Tier 1 status chips (see 27.2) always stay in sync — switching one updates the other.</w:t>
       </w:r>
     </w:p>
     <w:p>
@@ -11893,7 +12053,7 @@
           <w:b w:val="0"/>
           <w:sz w:val="20"/>
         </w:rPr>
-        <w:t>Search updates the list in real time.</w:t>
+        <w:t>Search updates the list in real time and the focus ring confirms the input is active.</w:t>
       </w:r>
     </w:p>
     <w:p>
@@ -11913,7 +12073,7 @@
           <w:b w:val="0"/>
           <w:sz w:val="20"/>
         </w:rPr>
-        <w:t>Filter tabs, side filters, and view toggle each change what is shown.</w:t>
+        <w:t>Side filter pills, view toggle, header filter tabs, and Tier 1 status chips each change what is shown.</w:t>
       </w:r>
     </w:p>
     <w:p>
@@ -12011,6 +12171,26 @@
     </w:p>
     <w:p>
       <w:pPr>
+        <w:spacing w:after="40"/>
+        <w:ind w:left="425" w:hanging="255"/>
+      </w:pPr>
+      <w:r>
+        <w:rPr>
+          <w:b w:val="0"/>
+          <w:sz w:val="20"/>
+        </w:rPr>
+        <w:t xml:space="preserve">-  </w:t>
+      </w:r>
+      <w:r>
+        <w:rPr>
+          <w:b w:val="0"/>
+          <w:sz w:val="20"/>
+        </w:rPr>
+        <w:t>Add text labels under the view-toggle icons on narrow screens so new users know what the icons mean without hovering.</w:t>
+      </w:r>
+    </w:p>
+    <w:p>
+      <w:pPr>
         <w:spacing w:before="200" w:after="60"/>
       </w:pPr>
       <w:r>
@@ -12114,7 +12294,7 @@
         <w:spacing w:after="80" w:before="280"/>
       </w:pPr>
       <w:r>
-        <w:t>27.2. All Documents — AI Briefing and completion progress</w:t>
+        <w:t>27.2. All Documents — AI Briefing, status quick-filters, and completion progress</w:t>
       </w:r>
     </w:p>
     <w:p>
@@ -12139,7 +12319,7 @@
           <w:b w:val="0"/>
           <w:sz w:val="20"/>
         </w:rPr>
-        <w:t>/documents (top of the content area)</w:t>
+        <w:t>/documents (AI Briefing strip + Tier 1 of the Unified Command Bar, at the top of the content area)</w:t>
       </w:r>
     </w:p>
     <w:p>
@@ -12172,7 +12352,7 @@
           <w:b w:val="0"/>
           <w:sz w:val="20"/>
         </w:rPr>
-        <w:t>Look at the AI Briefing strip at the top of the list.</w:t>
+        <w:t>Look at the AI Briefing strip at the top of the list (redesigned on April 20, 2026).</w:t>
       </w:r>
     </w:p>
     <w:p>
@@ -12192,7 +12372,7 @@
           <w:b w:val="0"/>
           <w:sz w:val="20"/>
         </w:rPr>
-        <w:t>A small 'AI BRIEFING' tag with a sparkle icon is visible.</w:t>
+        <w:t>A small 'AI BRIEFING' tag with an orange sparkle icon is visible on the left.</w:t>
       </w:r>
     </w:p>
     <w:p>
@@ -12212,7 +12392,7 @@
           <w:b w:val="0"/>
           <w:sz w:val="20"/>
         </w:rPr>
-        <w:t>A one-sentence summary of your overall document state is shown.</w:t>
+        <w:t>On wide screens, a muted 'Updated {date}' (or 'No recent document activity') timestamp sits at the far right of the badge row; on narrow screens that same timestamp appears below the summary paragraph instead.</w:t>
       </w:r>
     </w:p>
     <w:p>
@@ -12232,7 +12412,47 @@
           <w:b w:val="0"/>
           <w:sz w:val="20"/>
         </w:rPr>
-        <w:t>A primary action button appears on the right. The button text changes based on what is most urgent — for example 'Focus missing docs', 'Review signature queue', 'Review pending docs', or 'Review signed docs'.</w:t>
+        <w:t>A bold one-line headline and a slightly lighter one-sentence summary are shown below the badge row.</w:t>
+      </w:r>
+    </w:p>
+    <w:p>
+      <w:pPr>
+        <w:spacing w:after="40"/>
+        <w:ind w:left="907" w:hanging="255"/>
+      </w:pPr>
+      <w:r>
+        <w:rPr>
+          <w:b w:val="0"/>
+          <w:sz w:val="20"/>
+        </w:rPr>
+        <w:t xml:space="preserve">•  </w:t>
+      </w:r>
+      <w:r>
+        <w:rPr>
+          <w:b w:val="0"/>
+          <w:sz w:val="20"/>
+        </w:rPr>
+        <w:t>A blue primary action button sits on the right on wide screens and centres below the text on narrow screens. Its label changes based on what is most urgent — for example 'Focus missing docs', 'Review signature queue', 'Review pending docs', or 'Review signed docs'.</w:t>
+      </w:r>
+    </w:p>
+    <w:p>
+      <w:pPr>
+        <w:spacing w:after="40"/>
+        <w:ind w:left="907" w:hanging="255"/>
+      </w:pPr>
+      <w:r>
+        <w:rPr>
+          <w:b w:val="0"/>
+          <w:sz w:val="20"/>
+        </w:rPr>
+        <w:t xml:space="preserve">•  </w:t>
+      </w:r>
+      <w:r>
+        <w:rPr>
+          <w:b w:val="0"/>
+          <w:sz w:val="20"/>
+        </w:rPr>
+        <w:t>While the briefing is loading, the strip shows the AI Briefing badge with a spinner plus two skeleton lines (no layout jump when it resolves).</w:t>
       </w:r>
     </w:p>
     <w:p>
@@ -12252,7 +12472,27 @@
           <w:b w:val="0"/>
           <w:sz w:val="20"/>
         </w:rPr>
-        <w:t>Click the primary action button and watch which filter tab becomes active.</w:t>
+        <w:t>Click the primary action button.</w:t>
+      </w:r>
+    </w:p>
+    <w:p>
+      <w:pPr>
+        <w:spacing w:after="40"/>
+        <w:ind w:left="907" w:hanging="255"/>
+      </w:pPr>
+      <w:r>
+        <w:rPr>
+          <w:b w:val="0"/>
+          <w:sz w:val="20"/>
+        </w:rPr>
+        <w:t xml:space="preserve">•  </w:t>
+      </w:r>
+      <w:r>
+        <w:rPr>
+          <w:b w:val="0"/>
+          <w:sz w:val="20"/>
+        </w:rPr>
+        <w:t>The view resets to 'By Transaction' and the matching filter tab / status chip activates.</w:t>
       </w:r>
     </w:p>
     <w:p>
@@ -12272,7 +12512,7 @@
           <w:b w:val="0"/>
           <w:sz w:val="20"/>
         </w:rPr>
-        <w:t>Look at the completion progress bar directly below the briefing.</w:t>
+        <w:t>Directly below the briefing, find the Unified Command Bar. Focus on Tier 1 (the top row of the bar).</w:t>
       </w:r>
     </w:p>
     <w:p>
@@ -12292,7 +12532,267 @@
           <w:b w:val="0"/>
           <w:sz w:val="20"/>
         </w:rPr>
-        <w:t>A green-gradient bar is labelled 'Completion {%}' and shows the percentage of documents that are fully signed.</w:t>
+        <w:t>Tier 1 contains four status quick-filter chips followed by the completion progress bar.</w:t>
+      </w:r>
+    </w:p>
+    <w:p>
+      <w:pPr>
+        <w:spacing w:after="40"/>
+        <w:ind w:left="907" w:hanging="255"/>
+      </w:pPr>
+      <w:r>
+        <w:rPr>
+          <w:b w:val="0"/>
+          <w:sz w:val="20"/>
+        </w:rPr>
+        <w:t xml:space="preserve">•  </w:t>
+      </w:r>
+      <w:r>
+        <w:rPr>
+          <w:b w:val="0"/>
+          <w:sz w:val="20"/>
+        </w:rPr>
+        <w:t>Chips, in order: 'Signed' (green number), 'Pending' (blue number), 'Sent' (amber number), 'Missing' (red number) — each with a large count and a small label.</w:t>
+      </w:r>
+    </w:p>
+    <w:p>
+      <w:pPr>
+        <w:spacing w:after="40"/>
+        <w:ind w:left="907" w:hanging="255"/>
+      </w:pPr>
+      <w:r>
+        <w:rPr>
+          <w:b w:val="0"/>
+          <w:sz w:val="20"/>
+        </w:rPr>
+        <w:t xml:space="preserve">•  </w:t>
+      </w:r>
+      <w:r>
+        <w:rPr>
+          <w:b w:val="0"/>
+          <w:sz w:val="20"/>
+        </w:rPr>
+        <w:t>On narrow screens the four chips sit in a 2x2 or 4-column grid; on wide screens they sit in a single row.</w:t>
+      </w:r>
+    </w:p>
+    <w:p>
+      <w:pPr>
+        <w:spacing w:after="40"/>
+        <w:ind w:left="425" w:hanging="255"/>
+      </w:pPr>
+      <w:r>
+        <w:rPr>
+          <w:b w:val="0"/>
+          <w:sz w:val="20"/>
+        </w:rPr>
+        <w:t xml:space="preserve">-  </w:t>
+      </w:r>
+      <w:r>
+        <w:rPr>
+          <w:b w:val="0"/>
+          <w:sz w:val="20"/>
+        </w:rPr>
+        <w:t>Click one of the status chips.</w:t>
+      </w:r>
+    </w:p>
+    <w:p>
+      <w:pPr>
+        <w:spacing w:after="40"/>
+        <w:ind w:left="907" w:hanging="255"/>
+      </w:pPr>
+      <w:r>
+        <w:rPr>
+          <w:b w:val="0"/>
+          <w:sz w:val="20"/>
+        </w:rPr>
+        <w:t xml:space="preserve">•  </w:t>
+      </w:r>
+      <w:r>
+        <w:rPr>
+          <w:b w:val="0"/>
+          <w:sz w:val="20"/>
+        </w:rPr>
+        <w:t>The chip gains a coloured border and tinted background matching its number colour (green, blue, amber, or red).</w:t>
+      </w:r>
+    </w:p>
+    <w:p>
+      <w:pPr>
+        <w:spacing w:after="40"/>
+        <w:ind w:left="907" w:hanging="255"/>
+      </w:pPr>
+      <w:r>
+        <w:rPr>
+          <w:b w:val="0"/>
+          <w:sz w:val="20"/>
+        </w:rPr>
+        <w:t xml:space="preserve">•  </w:t>
+      </w:r>
+      <w:r>
+        <w:rPr>
+          <w:b w:val="0"/>
+          <w:sz w:val="20"/>
+        </w:rPr>
+        <w:t>The list below filters to only that status, and the header filter tab with the matching name also becomes active — the two controls stay in sync.</w:t>
+      </w:r>
+    </w:p>
+    <w:p>
+      <w:pPr>
+        <w:spacing w:after="40"/>
+        <w:ind w:left="907" w:hanging="255"/>
+      </w:pPr>
+      <w:r>
+        <w:rPr>
+          <w:b w:val="0"/>
+          <w:sz w:val="20"/>
+        </w:rPr>
+        <w:t xml:space="preserve">•  </w:t>
+      </w:r>
+      <w:r>
+        <w:rPr>
+          <w:b w:val="0"/>
+          <w:sz w:val="20"/>
+        </w:rPr>
+        <w:t>Hovering a chip shows a tooltip such as 'Filter by missing' when inactive, or 'Showing missing — click to clear' when active.</w:t>
+      </w:r>
+    </w:p>
+    <w:p>
+      <w:pPr>
+        <w:spacing w:after="40"/>
+        <w:ind w:left="425" w:hanging="255"/>
+      </w:pPr>
+      <w:r>
+        <w:rPr>
+          <w:b w:val="0"/>
+          <w:sz w:val="20"/>
+        </w:rPr>
+        <w:t xml:space="preserve">-  </w:t>
+      </w:r>
+      <w:r>
+        <w:rPr>
+          <w:b w:val="0"/>
+          <w:sz w:val="20"/>
+        </w:rPr>
+        <w:t>Click the already-active chip a second time.</w:t>
+      </w:r>
+    </w:p>
+    <w:p>
+      <w:pPr>
+        <w:spacing w:after="40"/>
+        <w:ind w:left="907" w:hanging="255"/>
+      </w:pPr>
+      <w:r>
+        <w:rPr>
+          <w:b w:val="0"/>
+          <w:sz w:val="20"/>
+        </w:rPr>
+        <w:t xml:space="preserve">•  </w:t>
+      </w:r>
+      <w:r>
+        <w:rPr>
+          <w:b w:val="0"/>
+          <w:sz w:val="20"/>
+        </w:rPr>
+        <w:t>The chip returns to its transparent state and the filter resets to 'All'.</w:t>
+      </w:r>
+    </w:p>
+    <w:p>
+      <w:pPr>
+        <w:spacing w:after="40"/>
+        <w:ind w:left="425" w:hanging="255"/>
+      </w:pPr>
+      <w:r>
+        <w:rPr>
+          <w:b w:val="0"/>
+          <w:sz w:val="20"/>
+        </w:rPr>
+        <w:t xml:space="preserve">-  </w:t>
+      </w:r>
+      <w:r>
+        <w:rPr>
+          <w:b w:val="0"/>
+          <w:sz w:val="20"/>
+        </w:rPr>
+        <w:t>Look at the completion progress bar on the right side of Tier 1.</w:t>
+      </w:r>
+    </w:p>
+    <w:p>
+      <w:pPr>
+        <w:spacing w:after="40"/>
+        <w:ind w:left="907" w:hanging="255"/>
+      </w:pPr>
+      <w:r>
+        <w:rPr>
+          <w:b w:val="0"/>
+          <w:sz w:val="20"/>
+        </w:rPr>
+        <w:t xml:space="preserve">•  </w:t>
+      </w:r>
+      <w:r>
+        <w:rPr>
+          <w:b w:val="0"/>
+          <w:sz w:val="20"/>
+        </w:rPr>
+        <w:t>The label 'Completion' appears to the left of the bar on screens at least 640 px wide (hidden on small phones to save space).</w:t>
+      </w:r>
+    </w:p>
+    <w:p>
+      <w:pPr>
+        <w:spacing w:after="40"/>
+        <w:ind w:left="907" w:hanging="255"/>
+      </w:pPr>
+      <w:r>
+        <w:rPr>
+          <w:b w:val="0"/>
+          <w:sz w:val="20"/>
+        </w:rPr>
+        <w:t xml:space="preserve">•  </w:t>
+      </w:r>
+      <w:r>
+        <w:rPr>
+          <w:b w:val="0"/>
+          <w:sz w:val="20"/>
+        </w:rPr>
+        <w:t>A thin green-gradient bar shows the percentage of tracked documents that are fully signed.</w:t>
+      </w:r>
+    </w:p>
+    <w:p>
+      <w:pPr>
+        <w:spacing w:after="40"/>
+        <w:ind w:left="907" w:hanging="255"/>
+      </w:pPr>
+      <w:r>
+        <w:rPr>
+          <w:b w:val="0"/>
+          <w:sz w:val="20"/>
+        </w:rPr>
+        <w:t xml:space="preserve">•  </w:t>
+      </w:r>
+      <w:r>
+        <w:rPr>
+          <w:b w:val="0"/>
+          <w:sz w:val="20"/>
+        </w:rPr>
+        <w:t>The numeric percentage is shown in bold green on the right of the bar.</w:t>
+      </w:r>
+    </w:p>
+    <w:p>
+      <w:pPr>
+        <w:spacing w:after="40"/>
+        <w:ind w:left="907" w:hanging="255"/>
+      </w:pPr>
+      <w:r>
+        <w:rPr>
+          <w:b w:val="0"/>
+          <w:sz w:val="20"/>
+        </w:rPr>
+        <w:t xml:space="preserve">•  </w:t>
+      </w:r>
+      <w:r>
+        <w:rPr>
+          <w:b w:val="0"/>
+          <w:sz w:val="20"/>
+        </w:rPr>
+        <w:t>On wide screens a thin vertical divider separates the chip group from the completion bar.</w:t>
       </w:r>
     </w:p>
     <w:p>
@@ -12325,7 +12825,7 @@
           <w:b w:val="0"/>
           <w:sz w:val="20"/>
         </w:rPr>
-        <w:t>The briefing sentence reflects the most urgent state of your document portfolio right now.</w:t>
+        <w:t>The AI briefing headline and summary reflect the most urgent state of your document portfolio right now, and the timestamp tells you how fresh the underlying data is.</w:t>
       </w:r>
     </w:p>
     <w:p>
@@ -12345,7 +12845,7 @@
           <w:b w:val="0"/>
           <w:sz w:val="20"/>
         </w:rPr>
-        <w:t>Clicking the action button switches to the matching filter tab.</w:t>
+        <w:t>Clicking the primary action button switches to the matching filter tab and 'By Transaction' view.</w:t>
       </w:r>
     </w:p>
     <w:p>
@@ -12365,7 +12865,27 @@
           <w:b w:val="0"/>
           <w:sz w:val="20"/>
         </w:rPr>
-        <w:t>The percentage on the progress bar matches the ratio of signed documents to total documents.</w:t>
+        <w:t>Each status quick-filter chip filters the list and stays in sync with the header filter tabs; clicking an active chip clears the filter.</w:t>
+      </w:r>
+    </w:p>
+    <w:p>
+      <w:pPr>
+        <w:spacing w:after="40"/>
+        <w:ind w:left="425" w:hanging="255"/>
+      </w:pPr>
+      <w:r>
+        <w:rPr>
+          <w:b w:val="0"/>
+          <w:sz w:val="20"/>
+        </w:rPr>
+        <w:t xml:space="preserve">-  </w:t>
+      </w:r>
+      <w:r>
+        <w:rPr>
+          <w:b w:val="0"/>
+          <w:sz w:val="20"/>
+        </w:rPr>
+        <w:t>The percentage on the progress bar matches the ratio of signed documents to the total of signed + pending + sent (missing rows are excluded from the denominator).</w:t>
       </w:r>
     </w:p>
     <w:p>
@@ -12439,6 +12959,26 @@
           <w:sz w:val="20"/>
         </w:rPr>
         <w:t>Add a 'Email this briefing to my manager' one-click action.</w:t>
+      </w:r>
+    </w:p>
+    <w:p>
+      <w:pPr>
+        <w:spacing w:after="40"/>
+        <w:ind w:left="425" w:hanging="255"/>
+      </w:pPr>
+      <w:r>
+        <w:rPr>
+          <w:b w:val="0"/>
+          <w:sz w:val="20"/>
+        </w:rPr>
+        <w:t xml:space="preserve">-  </w:t>
+      </w:r>
+      <w:r>
+        <w:rPr>
+          <w:b w:val="0"/>
+          <w:sz w:val="20"/>
+        </w:rPr>
+        <w:t>Let the user pin a favourite status chip so it is always pre-filtered on page load.</w:t>
       </w:r>
     </w:p>
     <w:p>

</xml_diff>

<commit_message>
docs: add All Documents workflow completion plan
- Add detailed All Documents remediation plan covering Cleared Today, reassign/reclassify, template recovery, sorting, deletion review, restore, bulk actions, and modal behavior
- Update client testing review coverage for the expanded document workflows
- Regenerate the testing review DOCX from the updated generator
</commit_message>
<xml_diff>
--- a/FRONTEND_CLIENT_TESTING_REVIEW.docx
+++ b/FRONTEND_CLIENT_TESTING_REVIEW.docx
@@ -9687,7 +9687,7 @@
           <w:b w:val="0"/>
           <w:sz w:val="20"/>
         </w:rPr>
-        <w:t>Opens from an expanded transaction card</w:t>
+        <w:t>Opens from the 'View / Add Documents' button on an expanded transaction card</w:t>
       </w:r>
     </w:p>
     <w:p>
@@ -9720,87 +9720,227 @@
           <w:b w:val="0"/>
           <w:sz w:val="20"/>
         </w:rPr>
-        <w:t>Open the Documents window.</w:t>
-      </w:r>
-    </w:p>
-    <w:p>
-      <w:pPr>
-        <w:spacing w:after="40"/>
-        <w:ind w:left="907" w:hanging="255"/>
-      </w:pPr>
-      <w:r>
-        <w:rPr>
-          <w:b w:val="0"/>
-          <w:sz w:val="20"/>
-        </w:rPr>
-        <w:t xml:space="preserve">•  </w:t>
-      </w:r>
-      <w:r>
-        <w:rPr>
-          <w:b w:val="0"/>
-          <w:sz w:val="20"/>
-        </w:rPr>
-        <w:t>Confirm the list of existing documents appears.</w:t>
-      </w:r>
-    </w:p>
-    <w:p>
-      <w:pPr>
-        <w:spacing w:after="40"/>
-        <w:ind w:left="907" w:hanging="255"/>
-      </w:pPr>
-      <w:r>
-        <w:rPr>
-          <w:b w:val="0"/>
-          <w:sz w:val="20"/>
-        </w:rPr>
-        <w:t xml:space="preserve">•  </w:t>
-      </w:r>
-      <w:r>
-        <w:rPr>
-          <w:b w:val="0"/>
-          <w:sz w:val="20"/>
-        </w:rPr>
-        <w:t>Expand Details on a document and read the metadata.</w:t>
-      </w:r>
-    </w:p>
-    <w:p>
-      <w:pPr>
-        <w:spacing w:after="40"/>
-        <w:ind w:left="425" w:hanging="255"/>
-      </w:pPr>
-      <w:r>
-        <w:rPr>
-          <w:b w:val="0"/>
-          <w:sz w:val="20"/>
-        </w:rPr>
-        <w:t xml:space="preserve">-  </w:t>
-      </w:r>
-      <w:r>
-        <w:rPr>
-          <w:b w:val="0"/>
-          <w:sz w:val="20"/>
-        </w:rPr>
-        <w:t>Click Download on a document.</w:t>
-      </w:r>
-    </w:p>
-    <w:p>
-      <w:pPr>
-        <w:spacing w:after="40"/>
-        <w:ind w:left="425" w:hanging="255"/>
-      </w:pPr>
-      <w:r>
-        <w:rPr>
-          <w:b w:val="0"/>
-          <w:sz w:val="20"/>
-        </w:rPr>
-        <w:t xml:space="preserve">-  </w:t>
-      </w:r>
-      <w:r>
-        <w:rPr>
-          <w:b w:val="0"/>
-          <w:sz w:val="20"/>
-        </w:rPr>
-        <w:t>Click Add Document and upload a new file.</w:t>
+        <w:t>Expand a transaction card on /transactions/active and click View / Add Documents.</w:t>
+      </w:r>
+    </w:p>
+    <w:p>
+      <w:pPr>
+        <w:spacing w:after="40"/>
+        <w:ind w:left="425" w:hanging="255"/>
+      </w:pPr>
+      <w:r>
+        <w:rPr>
+          <w:b w:val="0"/>
+          <w:sz w:val="20"/>
+        </w:rPr>
+        <w:t xml:space="preserve">-  </w:t>
+      </w:r>
+      <w:r>
+        <w:rPr>
+          <w:b w:val="0"/>
+          <w:sz w:val="20"/>
+        </w:rPr>
+        <w:t>Confirm the documents panel opens and lists every document on that transaction.</w:t>
+      </w:r>
+    </w:p>
+    <w:p>
+      <w:pPr>
+        <w:spacing w:after="40"/>
+        <w:ind w:left="425" w:hanging="255"/>
+      </w:pPr>
+      <w:r>
+        <w:rPr>
+          <w:b w:val="0"/>
+          <w:sz w:val="20"/>
+        </w:rPr>
+        <w:t xml:space="preserve">-  </w:t>
+      </w:r>
+      <w:r>
+        <w:rPr>
+          <w:b w:val="0"/>
+          <w:sz w:val="20"/>
+        </w:rPr>
+        <w:t>Confirm each row shows the document name, a status badge (Signed / Awaiting / Flagged / Uploaded), the version, the upload date, and the size.</w:t>
+      </w:r>
+    </w:p>
+    <w:p>
+      <w:pPr>
+        <w:spacing w:after="40"/>
+        <w:ind w:left="425" w:hanging="255"/>
+      </w:pPr>
+      <w:r>
+        <w:rPr>
+          <w:b w:val="0"/>
+          <w:sz w:val="20"/>
+        </w:rPr>
+        <w:t xml:space="preserve">-  </w:t>
+      </w:r>
+      <w:r>
+        <w:rPr>
+          <w:b w:val="0"/>
+          <w:sz w:val="20"/>
+        </w:rPr>
+        <w:t>Click Download on a row. Confirm the file opens in a new browser tab without being blocked by your pop-up blocker, even if the panel has been open for a while.</w:t>
+      </w:r>
+    </w:p>
+    <w:p>
+      <w:pPr>
+        <w:spacing w:after="40"/>
+        <w:ind w:left="425" w:hanging="255"/>
+      </w:pPr>
+      <w:r>
+        <w:rPr>
+          <w:b w:val="0"/>
+          <w:sz w:val="20"/>
+        </w:rPr>
+        <w:t xml:space="preserve">-  </w:t>
+      </w:r>
+      <w:r>
+        <w:rPr>
+          <w:b w:val="0"/>
+          <w:sz w:val="20"/>
+        </w:rPr>
+        <w:t>Click the document name. Confirm it also opens the download in a new tab.</w:t>
+      </w:r>
+    </w:p>
+    <w:p>
+      <w:pPr>
+        <w:spacing w:after="40"/>
+        <w:ind w:left="425" w:hanging="255"/>
+      </w:pPr>
+      <w:r>
+        <w:rPr>
+          <w:b w:val="0"/>
+          <w:sz w:val="20"/>
+        </w:rPr>
+        <w:t xml:space="preserve">-  </w:t>
+      </w:r>
+      <w:r>
+        <w:rPr>
+          <w:b w:val="0"/>
+          <w:sz w:val="20"/>
+        </w:rPr>
+        <w:t>Click Add Document and upload a new file. Confirm the new file appears in the list with its version and upload date.</w:t>
+      </w:r>
+    </w:p>
+    <w:p>
+      <w:pPr>
+        <w:spacing w:after="40"/>
+        <w:ind w:left="425" w:hanging="255"/>
+      </w:pPr>
+      <w:r>
+        <w:rPr>
+          <w:b w:val="0"/>
+          <w:sz w:val="20"/>
+        </w:rPr>
+        <w:t xml:space="preserve">-  </w:t>
+      </w:r>
+      <w:r>
+        <w:rPr>
+          <w:b w:val="0"/>
+          <w:sz w:val="20"/>
+        </w:rPr>
+        <w:t>Click the Email icon on a row (internal users only). Confirm the Email Document window opens above the panel and is clickable.</w:t>
+      </w:r>
+    </w:p>
+    <w:p>
+      <w:pPr>
+        <w:spacing w:after="40"/>
+        <w:ind w:left="425" w:hanging="255"/>
+      </w:pPr>
+      <w:r>
+        <w:rPr>
+          <w:b w:val="0"/>
+          <w:sz w:val="20"/>
+        </w:rPr>
+        <w:t xml:space="preserve">-  </w:t>
+      </w:r>
+      <w:r>
+        <w:rPr>
+          <w:b w:val="0"/>
+          <w:sz w:val="20"/>
+        </w:rPr>
+        <w:t>Click the Version history icon. Confirm the Version history panel opens above the panel and lists every version.</w:t>
+      </w:r>
+    </w:p>
+    <w:p>
+      <w:pPr>
+        <w:spacing w:after="40"/>
+        <w:ind w:left="425" w:hanging="255"/>
+      </w:pPr>
+      <w:r>
+        <w:rPr>
+          <w:b w:val="0"/>
+          <w:sz w:val="20"/>
+        </w:rPr>
+        <w:t xml:space="preserve">-  </w:t>
+      </w:r>
+      <w:r>
+        <w:rPr>
+          <w:b w:val="0"/>
+          <w:sz w:val="20"/>
+        </w:rPr>
+        <w:t>Open the three-dot menu on any row. As an internal user you should see Rename / Classify, Upload new version, and Archive. As a Client / FSBO / Vendor you should see Flag for deletion (or Flagged if you already flagged it).</w:t>
+      </w:r>
+    </w:p>
+    <w:p>
+      <w:pPr>
+        <w:spacing w:after="40"/>
+        <w:ind w:left="425" w:hanging="255"/>
+      </w:pPr>
+      <w:r>
+        <w:rPr>
+          <w:b w:val="0"/>
+          <w:sz w:val="20"/>
+        </w:rPr>
+        <w:t xml:space="preserve">-  </w:t>
+      </w:r>
+      <w:r>
+        <w:rPr>
+          <w:b w:val="0"/>
+          <w:sz w:val="20"/>
+        </w:rPr>
+        <w:t>Click Archive (internal) and confirm a confirmation window opens. Click Confirm and confirm the document leaves the list.</w:t>
+      </w:r>
+    </w:p>
+    <w:p>
+      <w:pPr>
+        <w:spacing w:after="40"/>
+        <w:ind w:left="425" w:hanging="255"/>
+      </w:pPr>
+      <w:r>
+        <w:rPr>
+          <w:b w:val="0"/>
+          <w:sz w:val="20"/>
+        </w:rPr>
+        <w:t xml:space="preserve">-  </w:t>
+      </w:r>
+      <w:r>
+        <w:rPr>
+          <w:b w:val="0"/>
+          <w:sz w:val="20"/>
+        </w:rPr>
+        <w:t>Click Flag for deletion (Client / FSBO / Vendor) and submit a reason. Confirm the row updates to show Flagged.</w:t>
+      </w:r>
+    </w:p>
+    <w:p>
+      <w:pPr>
+        <w:spacing w:after="40"/>
+        <w:ind w:left="425" w:hanging="255"/>
+      </w:pPr>
+      <w:r>
+        <w:rPr>
+          <w:b w:val="0"/>
+          <w:sz w:val="20"/>
+        </w:rPr>
+        <w:t xml:space="preserve">-  </w:t>
+      </w:r>
+      <w:r>
+        <w:rPr>
+          <w:b w:val="0"/>
+          <w:sz w:val="20"/>
+        </w:rPr>
+        <w:t>Press the Escape key — the panel should close.</w:t>
       </w:r>
     </w:p>
     <w:p>
@@ -9833,27 +9973,67 @@
           <w:b w:val="0"/>
           <w:sz w:val="20"/>
         </w:rPr>
-        <w:t>The download link opens the document.</w:t>
-      </w:r>
-    </w:p>
-    <w:p>
-      <w:pPr>
-        <w:spacing w:after="40"/>
-        <w:ind w:left="425" w:hanging="255"/>
-      </w:pPr>
-      <w:r>
-        <w:rPr>
-          <w:b w:val="0"/>
-          <w:sz w:val="20"/>
-        </w:rPr>
-        <w:t xml:space="preserve">-  </w:t>
-      </w:r>
-      <w:r>
-        <w:rPr>
-          <w:b w:val="0"/>
-          <w:sz w:val="20"/>
-        </w:rPr>
-        <w:t>The uploaded file appears in the list, with version and last-updated info.</w:t>
+        <w:t>Every action (Download, Email, Version history, Rename, Archive, Flag) opens its window or finishes its action visibly above the panel — no clicks land on something hidden behind the backdrop.</w:t>
+      </w:r>
+    </w:p>
+    <w:p>
+      <w:pPr>
+        <w:spacing w:after="40"/>
+        <w:ind w:left="425" w:hanging="255"/>
+      </w:pPr>
+      <w:r>
+        <w:rPr>
+          <w:b w:val="0"/>
+          <w:sz w:val="20"/>
+        </w:rPr>
+        <w:t xml:space="preserve">-  </w:t>
+      </w:r>
+      <w:r>
+        <w:rPr>
+          <w:b w:val="0"/>
+          <w:sz w:val="20"/>
+        </w:rPr>
+        <w:t>Download is not blocked by the browser's pop-up blocker.</w:t>
+      </w:r>
+    </w:p>
+    <w:p>
+      <w:pPr>
+        <w:spacing w:after="40"/>
+        <w:ind w:left="425" w:hanging="255"/>
+      </w:pPr>
+      <w:r>
+        <w:rPr>
+          <w:b w:val="0"/>
+          <w:sz w:val="20"/>
+        </w:rPr>
+        <w:t xml:space="preserve">-  </w:t>
+      </w:r>
+      <w:r>
+        <w:rPr>
+          <w:b w:val="0"/>
+          <w:sz w:val="20"/>
+        </w:rPr>
+        <w:t>Internal users can rename, classify, archive, and email a document from this panel. External users can flag a document for deletion.</w:t>
+      </w:r>
+    </w:p>
+    <w:p>
+      <w:pPr>
+        <w:spacing w:after="40"/>
+        <w:ind w:left="425" w:hanging="255"/>
+      </w:pPr>
+      <w:r>
+        <w:rPr>
+          <w:b w:val="0"/>
+          <w:sz w:val="20"/>
+        </w:rPr>
+        <w:t xml:space="preserve">-  </w:t>
+      </w:r>
+      <w:r>
+        <w:rPr>
+          <w:b w:val="0"/>
+          <w:sz w:val="20"/>
+        </w:rPr>
+        <w:t>Escape closes the panel.</w:t>
       </w:r>
     </w:p>
     <w:p>
@@ -9886,27 +10066,67 @@
           <w:b w:val="0"/>
           <w:sz w:val="20"/>
         </w:rPr>
-        <w:t>Let the user rename a document without leaving the page.</w:t>
-      </w:r>
-    </w:p>
-    <w:p>
-      <w:pPr>
-        <w:spacing w:after="40"/>
-        <w:ind w:left="425" w:hanging="255"/>
-      </w:pPr>
-      <w:r>
-        <w:rPr>
-          <w:b w:val="0"/>
-          <w:sz w:val="20"/>
-        </w:rPr>
-        <w:t xml:space="preserve">-  </w:t>
-      </w:r>
-      <w:r>
-        <w:rPr>
-          <w:b w:val="0"/>
-          <w:sz w:val="20"/>
-        </w:rPr>
-        <w:t>Suggest the document type automatically when uploading (Contract, Addendum, etc.).</w:t>
+        <w:t>Add a Preview window so PDFs render inline instead of opening in a new tab.</w:t>
+      </w:r>
+    </w:p>
+    <w:p>
+      <w:pPr>
+        <w:spacing w:after="40"/>
+        <w:ind w:left="425" w:hanging="255"/>
+      </w:pPr>
+      <w:r>
+        <w:rPr>
+          <w:b w:val="0"/>
+          <w:sz w:val="20"/>
+        </w:rPr>
+        <w:t xml:space="preserve">-  </w:t>
+      </w:r>
+      <w:r>
+        <w:rPr>
+          <w:b w:val="0"/>
+          <w:sz w:val="20"/>
+        </w:rPr>
+        <w:t>Add Send for Signature, Refresh status, and Void envelope buttons here so internal users can finish the signature flow without leaving the transaction card.</w:t>
+      </w:r>
+    </w:p>
+    <w:p>
+      <w:pPr>
+        <w:spacing w:after="40"/>
+        <w:ind w:left="425" w:hanging="255"/>
+      </w:pPr>
+      <w:r>
+        <w:rPr>
+          <w:b w:val="0"/>
+          <w:sz w:val="20"/>
+        </w:rPr>
+        <w:t xml:space="preserve">-  </w:t>
+      </w:r>
+      <w:r>
+        <w:rPr>
+          <w:b w:val="0"/>
+          <w:sz w:val="20"/>
+        </w:rPr>
+        <w:t>Add a status filter (All / Uploaded / Awaiting / Signed / Flagged) and a sort menu to make long document lists easier to scan.</w:t>
+      </w:r>
+    </w:p>
+    <w:p>
+      <w:pPr>
+        <w:spacing w:after="40"/>
+        <w:ind w:left="425" w:hanging="255"/>
+      </w:pPr>
+      <w:r>
+        <w:rPr>
+          <w:b w:val="0"/>
+          <w:sz w:val="20"/>
+        </w:rPr>
+        <w:t xml:space="preserve">-  </w:t>
+      </w:r>
+      <w:r>
+        <w:rPr>
+          <w:b w:val="0"/>
+          <w:sz w:val="20"/>
+        </w:rPr>
+        <w:t>Add an internal Mark for follow-up flag so the agent can mark a document they need to come back to.</w:t>
       </w:r>
     </w:p>
     <w:p>
@@ -12144,27 +12364,147 @@
           <w:b w:val="0"/>
           <w:sz w:val="20"/>
         </w:rPr>
-        <w:t>Click Upload on a missing-document row. Confirm the Upload Document modal opens with the transaction and document type already filled in.</w:t>
-      </w:r>
-    </w:p>
-    <w:p>
-      <w:pPr>
-        <w:spacing w:after="40"/>
-        <w:ind w:left="425" w:hanging="255"/>
-      </w:pPr>
-      <w:r>
-        <w:rPr>
-          <w:b w:val="0"/>
-          <w:sz w:val="20"/>
-        </w:rPr>
-        <w:t xml:space="preserve">-  </w:t>
-      </w:r>
-      <w:r>
-        <w:rPr>
-          <w:b w:val="0"/>
-          <w:sz w:val="20"/>
-        </w:rPr>
-        <w:t>Click Generate (Template) on a missing item that supports template generation. Confirm a draft document is created and the preview opens.</w:t>
+        <w:t>Click Upload on a missing-document row. Confirm the Upload Document modal opens with the transaction and document type already filled in, and that uploading clears the row.</w:t>
+      </w:r>
+    </w:p>
+    <w:p>
+      <w:pPr>
+        <w:spacing w:after="40"/>
+        <w:ind w:left="425" w:hanging="255"/>
+      </w:pPr>
+      <w:r>
+        <w:rPr>
+          <w:b w:val="0"/>
+          <w:sz w:val="20"/>
+        </w:rPr>
+        <w:t xml:space="preserve">-  </w:t>
+      </w:r>
+      <w:r>
+        <w:rPr>
+          <w:b w:val="0"/>
+          <w:sz w:val="20"/>
+        </w:rPr>
+        <w:t>Find a missing item that does not have a template ready (for example Appraisal Report). Confirm the Generate button is NOT shown — only Upload / Request / Call appear.</w:t>
+      </w:r>
+    </w:p>
+    <w:p>
+      <w:pPr>
+        <w:spacing w:after="40"/>
+        <w:ind w:left="425" w:hanging="255"/>
+      </w:pPr>
+      <w:r>
+        <w:rPr>
+          <w:b w:val="0"/>
+          <w:sz w:val="20"/>
+        </w:rPr>
+        <w:t xml:space="preserve">-  </w:t>
+      </w:r>
+      <w:r>
+        <w:rPr>
+          <w:b w:val="0"/>
+          <w:sz w:val="20"/>
+        </w:rPr>
+        <w:t>Find a missing item that does have a template ready (for example Lead-Based Paint Disclosure). Click Generate.</w:t>
+      </w:r>
+    </w:p>
+    <w:p>
+      <w:pPr>
+        <w:spacing w:after="40"/>
+        <w:ind w:left="425" w:hanging="255"/>
+      </w:pPr>
+      <w:r>
+        <w:rPr>
+          <w:b w:val="0"/>
+          <w:sz w:val="20"/>
+        </w:rPr>
+        <w:t xml:space="preserve">-  </w:t>
+      </w:r>
+      <w:r>
+        <w:rPr>
+          <w:b w:val="0"/>
+          <w:sz w:val="20"/>
+        </w:rPr>
+        <w:t>If the transaction has all the information the template needs, confirm a draft document is created and the preview opens.</w:t>
+      </w:r>
+    </w:p>
+    <w:p>
+      <w:pPr>
+        <w:spacing w:after="40"/>
+        <w:ind w:left="425" w:hanging="255"/>
+      </w:pPr>
+      <w:r>
+        <w:rPr>
+          <w:b w:val="0"/>
+          <w:sz w:val="20"/>
+        </w:rPr>
+        <w:t xml:space="preserve">-  </w:t>
+      </w:r>
+      <w:r>
+        <w:rPr>
+          <w:b w:val="0"/>
+          <w:sz w:val="20"/>
+        </w:rPr>
+        <w:t>If the transaction is missing information (for example the seller name), confirm an 'Almost ready' window appears listing each missing piece in plain English and a Fix button next to each one.</w:t>
+      </w:r>
+    </w:p>
+    <w:p>
+      <w:pPr>
+        <w:spacing w:after="40"/>
+        <w:ind w:left="425" w:hanging="255"/>
+      </w:pPr>
+      <w:r>
+        <w:rPr>
+          <w:b w:val="0"/>
+          <w:sz w:val="20"/>
+        </w:rPr>
+        <w:t xml:space="preserve">-  </w:t>
+      </w:r>
+      <w:r>
+        <w:rPr>
+          <w:b w:val="0"/>
+          <w:sz w:val="20"/>
+        </w:rPr>
+        <w:t>Click Fix on one of the missing pieces. Confirm you are taken straight to the transaction page with the right field highlighted. Fill it in.</w:t>
+      </w:r>
+    </w:p>
+    <w:p>
+      <w:pPr>
+        <w:spacing w:after="40"/>
+        <w:ind w:left="425" w:hanging="255"/>
+      </w:pPr>
+      <w:r>
+        <w:rPr>
+          <w:b w:val="0"/>
+          <w:sz w:val="20"/>
+        </w:rPr>
+        <w:t xml:space="preserve">-  </w:t>
+      </w:r>
+      <w:r>
+        <w:rPr>
+          <w:b w:val="0"/>
+          <w:sz w:val="20"/>
+        </w:rPr>
+        <w:t>Come back to /documents. Confirm the Generate action retries on its own and either opens the draft or shows the next missing piece. You should not have to click Generate a second time.</w:t>
+      </w:r>
+    </w:p>
+    <w:p>
+      <w:pPr>
+        <w:spacing w:after="40"/>
+        <w:ind w:left="425" w:hanging="255"/>
+      </w:pPr>
+      <w:r>
+        <w:rPr>
+          <w:b w:val="0"/>
+          <w:sz w:val="20"/>
+        </w:rPr>
+        <w:t xml:space="preserve">-  </w:t>
+      </w:r>
+      <w:r>
+        <w:rPr>
+          <w:b w:val="0"/>
+          <w:sz w:val="20"/>
+        </w:rPr>
+        <w:t>Trigger Generate on a requirement that has no template at all (rare). Confirm the window now offers real next-step buttons — Upload draft manually or Request from counter-party — instead of a dead 'Got it' button.</w:t>
       </w:r>
     </w:p>
     <w:p>
@@ -12204,7 +12544,7 @@
           <w:b w:val="0"/>
           <w:sz w:val="20"/>
         </w:rPr>
-        <w:t>Click Mark N/A on any row. Confirm a confirmation appears, the row disappears, and an Undo toast restores it if clicked.</w:t>
+        <w:t>Click Mark N/A on any row. Confirm a confirmation appears, the row disappears, and an Undo option is available on the Cleared Today card.</w:t>
       </w:r>
     </w:p>
     <w:p>
@@ -12342,6 +12682,46 @@
     </w:p>
     <w:p>
       <w:pPr>
+        <w:spacing w:after="40"/>
+        <w:ind w:left="425" w:hanging="255"/>
+      </w:pPr>
+      <w:r>
+        <w:rPr>
+          <w:b w:val="0"/>
+          <w:sz w:val="20"/>
+        </w:rPr>
+        <w:t xml:space="preserve">-  </w:t>
+      </w:r>
+      <w:r>
+        <w:rPr>
+          <w:b w:val="0"/>
+          <w:sz w:val="20"/>
+        </w:rPr>
+        <w:t>Generate is only offered when the system actually has a template for that requirement.</w:t>
+      </w:r>
+    </w:p>
+    <w:p>
+      <w:pPr>
+        <w:spacing w:after="40"/>
+        <w:ind w:left="425" w:hanging="255"/>
+      </w:pPr>
+      <w:r>
+        <w:rPr>
+          <w:b w:val="0"/>
+          <w:sz w:val="20"/>
+        </w:rPr>
+        <w:t xml:space="preserve">-  </w:t>
+      </w:r>
+      <w:r>
+        <w:rPr>
+          <w:b w:val="0"/>
+          <w:sz w:val="20"/>
+        </w:rPr>
+        <w:t>The missing-fields window never shows raw machine names — every line is plain English with a Fix button.</w:t>
+      </w:r>
+    </w:p>
+    <w:p>
+      <w:pPr>
         <w:spacing w:before="200" w:after="60"/>
       </w:pPr>
       <w:r>
@@ -12390,7 +12770,7 @@
           <w:b w:val="0"/>
           <w:sz w:val="20"/>
         </w:rPr>
-        <w:t>Bulk-select rows for batch Request or Mark N/A.</w:t>
+        <w:t>Add a 'Skip this field' option on the missing-fields window for rare cases where a value is genuinely unavailable.</w:t>
       </w:r>
     </w:p>
     <w:p>
@@ -12523,7 +12903,7 @@
           <w:b w:val="0"/>
           <w:sz w:val="20"/>
         </w:rPr>
-        <w:t>/documents (strip at the bottom of the AI Priority list)</w:t>
+        <w:t>/documents (strip at the bottom of the page)</w:t>
       </w:r>
     </w:p>
     <w:p>
@@ -12556,47 +12936,287 @@
           <w:b w:val="0"/>
           <w:sz w:val="20"/>
         </w:rPr>
-        <w:t>Mark a few items resolved (Approve, Mark N/A, Upload, sign, or generate) and confirm each one appears in the Cleared Today strip.</w:t>
-      </w:r>
-    </w:p>
-    <w:p>
-      <w:pPr>
-        <w:spacing w:after="40"/>
-        <w:ind w:left="425" w:hanging="255"/>
-      </w:pPr>
-      <w:r>
-        <w:rPr>
-          <w:b w:val="0"/>
-          <w:sz w:val="20"/>
-        </w:rPr>
-        <w:t xml:space="preserve">-  </w:t>
-      </w:r>
-      <w:r>
-        <w:rPr>
-          <w:b w:val="0"/>
-          <w:sz w:val="20"/>
-        </w:rPr>
-        <w:t>Click a card in the strip that points to a real document and confirm the preview opens.</w:t>
-      </w:r>
-    </w:p>
-    <w:p>
-      <w:pPr>
-        <w:spacing w:after="40"/>
-        <w:ind w:left="425" w:hanging="255"/>
-      </w:pPr>
-      <w:r>
-        <w:rPr>
-          <w:b w:val="0"/>
-          <w:sz w:val="20"/>
-        </w:rPr>
-        <w:t xml:space="preserve">-  </w:t>
-      </w:r>
-      <w:r>
-        <w:rPr>
-          <w:b w:val="0"/>
-          <w:sz w:val="20"/>
-        </w:rPr>
-        <w:t>Click a card for a Mark N/A item and confirm the priority detail / audit view opens (not a dead preview).</w:t>
+        <w:t>Read the Cleared Today header. There should be a one-line description telling you what the strip is — items resolved in the last 24 hours.</w:t>
+      </w:r>
+    </w:p>
+    <w:p>
+      <w:pPr>
+        <w:spacing w:after="40"/>
+        <w:ind w:left="425" w:hanging="255"/>
+      </w:pPr>
+      <w:r>
+        <w:rPr>
+          <w:b w:val="0"/>
+          <w:sz w:val="20"/>
+        </w:rPr>
+        <w:t xml:space="preserve">-  </w:t>
+      </w:r>
+      <w:r>
+        <w:rPr>
+          <w:b w:val="0"/>
+          <w:sz w:val="20"/>
+        </w:rPr>
+        <w:t>Click the information icon next to the header. A short pop-up should explain what each kind of card means (Signed, Approved, Marked N/A, Generated, Replaced, Voided, Uploaded, Reassigned).</w:t>
+      </w:r>
+    </w:p>
+    <w:p>
+      <w:pPr>
+        <w:spacing w:after="40"/>
+        <w:ind w:left="425" w:hanging="255"/>
+      </w:pPr>
+      <w:r>
+        <w:rPr>
+          <w:b w:val="0"/>
+          <w:sz w:val="20"/>
+        </w:rPr>
+        <w:t xml:space="preserve">-  </w:t>
+      </w:r>
+      <w:r>
+        <w:rPr>
+          <w:b w:val="0"/>
+          <w:sz w:val="20"/>
+        </w:rPr>
+        <w:t>Confirm the strip is visible on every tab (AI Priority, Missing, All Docs, Pending Review, Sent for Signature, Signed) — not only on AI Priority.</w:t>
+      </w:r>
+    </w:p>
+    <w:p>
+      <w:pPr>
+        <w:spacing w:after="40"/>
+        <w:ind w:left="425" w:hanging="255"/>
+      </w:pPr>
+      <w:r>
+        <w:rPr>
+          <w:b w:val="0"/>
+          <w:sz w:val="20"/>
+        </w:rPr>
+        <w:t xml:space="preserve">-  </w:t>
+      </w:r>
+      <w:r>
+        <w:rPr>
+          <w:b w:val="0"/>
+          <w:sz w:val="20"/>
+        </w:rPr>
+        <w:t>Resolve a few items different ways (Approve a review, Mark something N/A, Upload a missing document, sign an envelope, generate a draft). Confirm each one shows up as a card on the strip with the matching label.</w:t>
+      </w:r>
+    </w:p>
+    <w:p>
+      <w:pPr>
+        <w:spacing w:after="40"/>
+        <w:ind w:left="425" w:hanging="255"/>
+      </w:pPr>
+      <w:r>
+        <w:rPr>
+          <w:b w:val="0"/>
+          <w:sz w:val="20"/>
+        </w:rPr>
+        <w:t xml:space="preserve">-  </w:t>
+      </w:r>
+      <w:r>
+        <w:rPr>
+          <w:b w:val="0"/>
+          <w:sz w:val="20"/>
+        </w:rPr>
+        <w:t>Send a Request or Nudge from a row. Confirm those touches do NOT show up here — only true resolutions appear on the strip.</w:t>
+      </w:r>
+    </w:p>
+    <w:p>
+      <w:pPr>
+        <w:spacing w:after="40"/>
+        <w:ind w:left="425" w:hanging="255"/>
+      </w:pPr>
+      <w:r>
+        <w:rPr>
+          <w:b w:val="0"/>
+          <w:sz w:val="20"/>
+        </w:rPr>
+        <w:t xml:space="preserve">-  </w:t>
+      </w:r>
+      <w:r>
+        <w:rPr>
+          <w:b w:val="0"/>
+          <w:sz w:val="20"/>
+        </w:rPr>
+        <w:t>On any card, click View Details. Confirm a small read-only window opens with the document name, the transaction, the badge, who cleared it, and when. (No more single whole-card click — every card has clear buttons.)</w:t>
+      </w:r>
+    </w:p>
+    <w:p>
+      <w:pPr>
+        <w:spacing w:after="40"/>
+        <w:ind w:left="425" w:hanging="255"/>
+      </w:pPr>
+      <w:r>
+        <w:rPr>
+          <w:b w:val="0"/>
+          <w:sz w:val="20"/>
+        </w:rPr>
+        <w:t xml:space="preserve">-  </w:t>
+      </w:r>
+      <w:r>
+        <w:rPr>
+          <w:b w:val="0"/>
+          <w:sz w:val="20"/>
+        </w:rPr>
+        <w:t>On a card that points to a real document, click Open. Confirm the document preview opens.</w:t>
+      </w:r>
+    </w:p>
+    <w:p>
+      <w:pPr>
+        <w:spacing w:after="40"/>
+        <w:ind w:left="425" w:hanging="255"/>
+      </w:pPr>
+      <w:r>
+        <w:rPr>
+          <w:b w:val="0"/>
+          <w:sz w:val="20"/>
+        </w:rPr>
+        <w:t xml:space="preserve">-  </w:t>
+      </w:r>
+      <w:r>
+        <w:rPr>
+          <w:b w:val="0"/>
+          <w:sz w:val="20"/>
+        </w:rPr>
+        <w:t>On a Mark N/A card (which does not have a document attached), click Open. Confirm the transaction's Documents view opens — not a dead window.</w:t>
+      </w:r>
+    </w:p>
+    <w:p>
+      <w:pPr>
+        <w:spacing w:after="40"/>
+        <w:ind w:left="425" w:hanging="255"/>
+      </w:pPr>
+      <w:r>
+        <w:rPr>
+          <w:b w:val="0"/>
+          <w:sz w:val="20"/>
+        </w:rPr>
+        <w:t xml:space="preserve">-  </w:t>
+      </w:r>
+      <w:r>
+        <w:rPr>
+          <w:b w:val="0"/>
+          <w:sz w:val="20"/>
+        </w:rPr>
+        <w:t>On an Approved card, click Undo. Confirm the document goes back to Pending Review.</w:t>
+      </w:r>
+    </w:p>
+    <w:p>
+      <w:pPr>
+        <w:spacing w:after="40"/>
+        <w:ind w:left="425" w:hanging="255"/>
+      </w:pPr>
+      <w:r>
+        <w:rPr>
+          <w:b w:val="0"/>
+          <w:sz w:val="20"/>
+        </w:rPr>
+        <w:t xml:space="preserve">-  </w:t>
+      </w:r>
+      <w:r>
+        <w:rPr>
+          <w:b w:val="0"/>
+          <w:sz w:val="20"/>
+        </w:rPr>
+        <w:t>On a Mark N/A card, click Undo. Confirm the row returns to the Missing list.</w:t>
+      </w:r>
+    </w:p>
+    <w:p>
+      <w:pPr>
+        <w:spacing w:after="40"/>
+        <w:ind w:left="425" w:hanging="255"/>
+      </w:pPr>
+      <w:r>
+        <w:rPr>
+          <w:b w:val="0"/>
+          <w:sz w:val="20"/>
+        </w:rPr>
+        <w:t xml:space="preserve">-  </w:t>
+      </w:r>
+      <w:r>
+        <w:rPr>
+          <w:b w:val="0"/>
+          <w:sz w:val="20"/>
+        </w:rPr>
+        <w:t>On a Generated card, click Undo and confirm the draft is removed and the Missing row comes back.</w:t>
+      </w:r>
+    </w:p>
+    <w:p>
+      <w:pPr>
+        <w:spacing w:after="40"/>
+        <w:ind w:left="425" w:hanging="255"/>
+      </w:pPr>
+      <w:r>
+        <w:rPr>
+          <w:b w:val="0"/>
+          <w:sz w:val="20"/>
+        </w:rPr>
+        <w:t xml:space="preserve">-  </w:t>
+      </w:r>
+      <w:r>
+        <w:rPr>
+          <w:b w:val="0"/>
+          <w:sz w:val="20"/>
+        </w:rPr>
+        <w:t>On a Signed card, confirm Undo is not offered, and a short explanation tells you to void the envelope from the document row instead.</w:t>
+      </w:r>
+    </w:p>
+    <w:p>
+      <w:pPr>
+        <w:spacing w:after="40"/>
+        <w:ind w:left="425" w:hanging="255"/>
+      </w:pPr>
+      <w:r>
+        <w:rPr>
+          <w:b w:val="0"/>
+          <w:sz w:val="20"/>
+        </w:rPr>
+        <w:t xml:space="preserve">-  </w:t>
+      </w:r>
+      <w:r>
+        <w:rPr>
+          <w:b w:val="0"/>
+          <w:sz w:val="20"/>
+        </w:rPr>
+        <w:t>Use the filter buttons at the top of the strip: All, Me, Team. Confirm Me shows only items you cleared, Team shows your teammates' clears, and All shows both.</w:t>
+      </w:r>
+    </w:p>
+    <w:p>
+      <w:pPr>
+        <w:spacing w:after="40"/>
+        <w:ind w:left="425" w:hanging="255"/>
+      </w:pPr>
+      <w:r>
+        <w:rPr>
+          <w:b w:val="0"/>
+          <w:sz w:val="20"/>
+        </w:rPr>
+        <w:t xml:space="preserve">-  </w:t>
+      </w:r>
+      <w:r>
+        <w:rPr>
+          <w:b w:val="0"/>
+          <w:sz w:val="20"/>
+        </w:rPr>
+        <w:t>Click 'View all cleared (last 7 days)'. Confirm a panel slides out listing every clear from the past week with the same filter buttons. Scroll down — more rows should load as you reach the bottom.</w:t>
+      </w:r>
+    </w:p>
+    <w:p>
+      <w:pPr>
+        <w:spacing w:after="40"/>
+        <w:ind w:left="425" w:hanging="255"/>
+      </w:pPr>
+      <w:r>
+        <w:rPr>
+          <w:b w:val="0"/>
+          <w:sz w:val="20"/>
+        </w:rPr>
+        <w:t xml:space="preserve">-  </w:t>
+      </w:r>
+      <w:r>
+        <w:rPr>
+          <w:b w:val="0"/>
+          <w:sz w:val="20"/>
+        </w:rPr>
+        <w:t>If you are signed in as a solo agent with no teammates, confirm the Team filter button is not shown.</w:t>
       </w:r>
     </w:p>
     <w:p>
@@ -12629,27 +13249,107 @@
           <w:b w:val="0"/>
           <w:sz w:val="20"/>
         </w:rPr>
-        <w:t>Only items that were truly resolved today show up in the strip. Requests, nudges, calls, and forwards do not appear here.</w:t>
-      </w:r>
-    </w:p>
-    <w:p>
-      <w:pPr>
-        <w:spacing w:after="40"/>
-        <w:ind w:left="425" w:hanging="255"/>
-      </w:pPr>
-      <w:r>
-        <w:rPr>
-          <w:b w:val="0"/>
-          <w:sz w:val="20"/>
-        </w:rPr>
-        <w:t xml:space="preserve">-  </w:t>
-      </w:r>
-      <w:r>
-        <w:rPr>
-          <w:b w:val="0"/>
-          <w:sz w:val="20"/>
-        </w:rPr>
-        <w:t>Each card opens the most useful detail for that item.</w:t>
+        <w:t>The strip explains itself — a new user can tell what it is and what each card means without help.</w:t>
+      </w:r>
+    </w:p>
+    <w:p>
+      <w:pPr>
+        <w:spacing w:after="40"/>
+        <w:ind w:left="425" w:hanging="255"/>
+      </w:pPr>
+      <w:r>
+        <w:rPr>
+          <w:b w:val="0"/>
+          <w:sz w:val="20"/>
+        </w:rPr>
+        <w:t xml:space="preserve">-  </w:t>
+      </w:r>
+      <w:r>
+        <w:rPr>
+          <w:b w:val="0"/>
+          <w:sz w:val="20"/>
+        </w:rPr>
+        <w:t>Cards never use a single 'click the whole card' target. Every card has a View Details button, an Open button, and an Undo where it makes sense.</w:t>
+      </w:r>
+    </w:p>
+    <w:p>
+      <w:pPr>
+        <w:spacing w:after="40"/>
+        <w:ind w:left="425" w:hanging="255"/>
+      </w:pPr>
+      <w:r>
+        <w:rPr>
+          <w:b w:val="0"/>
+          <w:sz w:val="20"/>
+        </w:rPr>
+        <w:t xml:space="preserve">-  </w:t>
+      </w:r>
+      <w:r>
+        <w:rPr>
+          <w:b w:val="0"/>
+          <w:sz w:val="20"/>
+        </w:rPr>
+        <w:t>Only true resolutions appear on the strip — requests, nudges, calls, and forwards do not.</w:t>
+      </w:r>
+    </w:p>
+    <w:p>
+      <w:pPr>
+        <w:spacing w:after="40"/>
+        <w:ind w:left="425" w:hanging="255"/>
+      </w:pPr>
+      <w:r>
+        <w:rPr>
+          <w:b w:val="0"/>
+          <w:sz w:val="20"/>
+        </w:rPr>
+        <w:t xml:space="preserve">-  </w:t>
+      </w:r>
+      <w:r>
+        <w:rPr>
+          <w:b w:val="0"/>
+          <w:sz w:val="20"/>
+        </w:rPr>
+        <w:t>Undo works for Approve, Mark N/A, Generated, and Uploaded clears. Signed, Replaced, and Voided clears explain why they cannot be undone here.</w:t>
+      </w:r>
+    </w:p>
+    <w:p>
+      <w:pPr>
+        <w:spacing w:after="40"/>
+        <w:ind w:left="425" w:hanging="255"/>
+      </w:pPr>
+      <w:r>
+        <w:rPr>
+          <w:b w:val="0"/>
+          <w:sz w:val="20"/>
+        </w:rPr>
+        <w:t xml:space="preserve">-  </w:t>
+      </w:r>
+      <w:r>
+        <w:rPr>
+          <w:b w:val="0"/>
+          <w:sz w:val="20"/>
+        </w:rPr>
+        <w:t>Switching to Me filters the strip to your own clears; Team shows your teammates'.</w:t>
+      </w:r>
+    </w:p>
+    <w:p>
+      <w:pPr>
+        <w:spacing w:after="40"/>
+        <w:ind w:left="425" w:hanging="255"/>
+      </w:pPr>
+      <w:r>
+        <w:rPr>
+          <w:b w:val="0"/>
+          <w:sz w:val="20"/>
+        </w:rPr>
+        <w:t xml:space="preserve">-  </w:t>
+      </w:r>
+      <w:r>
+        <w:rPr>
+          <w:b w:val="0"/>
+          <w:sz w:val="20"/>
+        </w:rPr>
+        <w:t>The 7-day panel shows the same items beyond the last 24 hours, with the same filter buttons.</w:t>
       </w:r>
     </w:p>
     <w:p>
@@ -12682,27 +13382,47 @@
           <w:b w:val="0"/>
           <w:sz w:val="20"/>
         </w:rPr>
-        <w:t>Add a one-click Undo on each card for accidental clears.</w:t>
-      </w:r>
-    </w:p>
-    <w:p>
-      <w:pPr>
-        <w:spacing w:after="40"/>
-        <w:ind w:left="425" w:hanging="255"/>
-      </w:pPr>
-      <w:r>
-        <w:rPr>
-          <w:b w:val="0"/>
-          <w:sz w:val="20"/>
-        </w:rPr>
-        <w:t xml:space="preserve">-  </w:t>
-      </w:r>
-      <w:r>
-        <w:rPr>
-          <w:b w:val="0"/>
-          <w:sz w:val="20"/>
-        </w:rPr>
-        <w:t>Let the user filter the strip by who cleared the item (self vs. teammate).</w:t>
+        <w:t>Show a small badge on the Cleared Today header when new items land while you're on a different tab.</w:t>
+      </w:r>
+    </w:p>
+    <w:p>
+      <w:pPr>
+        <w:spacing w:after="40"/>
+        <w:ind w:left="425" w:hanging="255"/>
+      </w:pPr>
+      <w:r>
+        <w:rPr>
+          <w:b w:val="0"/>
+          <w:sz w:val="20"/>
+        </w:rPr>
+        <w:t xml:space="preserve">-  </w:t>
+      </w:r>
+      <w:r>
+        <w:rPr>
+          <w:b w:val="0"/>
+          <w:sz w:val="20"/>
+        </w:rPr>
+        <w:t>Group the 7-day panel by day so it reads like a timeline.</w:t>
+      </w:r>
+    </w:p>
+    <w:p>
+      <w:pPr>
+        <w:spacing w:after="40"/>
+        <w:ind w:left="425" w:hanging="255"/>
+      </w:pPr>
+      <w:r>
+        <w:rPr>
+          <w:b w:val="0"/>
+          <w:sz w:val="20"/>
+        </w:rPr>
+        <w:t xml:space="preserve">-  </w:t>
+      </w:r>
+      <w:r>
+        <w:rPr>
+          <w:b w:val="0"/>
+          <w:sz w:val="20"/>
+        </w:rPr>
+        <w:t>Let the user export the 7-day list to CSV for end-of-week reporting.</w:t>
       </w:r>
     </w:p>
     <w:p>
@@ -13187,7 +13907,7 @@
           <w:b w:val="0"/>
           <w:sz w:val="20"/>
         </w:rPr>
-        <w:t>Eye icon on any document row</w:t>
+        <w:t>Preview (eye) and Download icons on any document row</w:t>
       </w:r>
     </w:p>
     <w:p>
@@ -13220,67 +13940,87 @@
           <w:b w:val="0"/>
           <w:sz w:val="20"/>
         </w:rPr>
-        <w:t>Click the Preview (eye) icon on a PDF or image — the document should render inline.</w:t>
-      </w:r>
-    </w:p>
-    <w:p>
-      <w:pPr>
-        <w:spacing w:after="40"/>
-        <w:ind w:left="425" w:hanging="255"/>
-      </w:pPr>
-      <w:r>
-        <w:rPr>
-          <w:b w:val="0"/>
-          <w:sz w:val="20"/>
-        </w:rPr>
-        <w:t xml:space="preserve">-  </w:t>
-      </w:r>
-      <w:r>
-        <w:rPr>
-          <w:b w:val="0"/>
-          <w:sz w:val="20"/>
-        </w:rPr>
-        <w:t>Click Preview on a non-previewable file (for example a .docx) — the modal should offer a Download button instead.</w:t>
-      </w:r>
-    </w:p>
-    <w:p>
-      <w:pPr>
-        <w:spacing w:after="40"/>
-        <w:ind w:left="425" w:hanging="255"/>
-      </w:pPr>
-      <w:r>
-        <w:rPr>
-          <w:b w:val="0"/>
-          <w:sz w:val="20"/>
-        </w:rPr>
-        <w:t xml:space="preserve">-  </w:t>
-      </w:r>
-      <w:r>
-        <w:rPr>
-          <w:b w:val="0"/>
-          <w:sz w:val="20"/>
-        </w:rPr>
-        <w:t>Click the Download icon directly on the row, without opening Preview first.</w:t>
-      </w:r>
-    </w:p>
-    <w:p>
-      <w:pPr>
-        <w:spacing w:after="40"/>
-        <w:ind w:left="425" w:hanging="255"/>
-      </w:pPr>
-      <w:r>
-        <w:rPr>
-          <w:b w:val="0"/>
-          <w:sz w:val="20"/>
-        </w:rPr>
-        <w:t xml:space="preserve">-  </w:t>
-      </w:r>
-      <w:r>
-        <w:rPr>
-          <w:b w:val="0"/>
-          <w:sz w:val="20"/>
-        </w:rPr>
-        <w:t>From inside the Preview modal, click Send for Signature.</w:t>
+        <w:t>Click the Preview (eye) icon on a PDF or image — the document should open inside the window.</w:t>
+      </w:r>
+    </w:p>
+    <w:p>
+      <w:pPr>
+        <w:spacing w:after="40"/>
+        <w:ind w:left="425" w:hanging="255"/>
+      </w:pPr>
+      <w:r>
+        <w:rPr>
+          <w:b w:val="0"/>
+          <w:sz w:val="20"/>
+        </w:rPr>
+        <w:t xml:space="preserve">-  </w:t>
+      </w:r>
+      <w:r>
+        <w:rPr>
+          <w:b w:val="0"/>
+          <w:sz w:val="20"/>
+        </w:rPr>
+        <w:t>Click Preview on a non-previewable file (for example a .docx) — the window should offer a Download button instead.</w:t>
+      </w:r>
+    </w:p>
+    <w:p>
+      <w:pPr>
+        <w:spacing w:after="40"/>
+        <w:ind w:left="425" w:hanging="255"/>
+      </w:pPr>
+      <w:r>
+        <w:rPr>
+          <w:b w:val="0"/>
+          <w:sz w:val="20"/>
+        </w:rPr>
+        <w:t xml:space="preserve">-  </w:t>
+      </w:r>
+      <w:r>
+        <w:rPr>
+          <w:b w:val="0"/>
+          <w:sz w:val="20"/>
+        </w:rPr>
+        <w:t>Click the Download icon on a row. The document should open in a new browser tab.</w:t>
+      </w:r>
+    </w:p>
+    <w:p>
+      <w:pPr>
+        <w:spacing w:after="40"/>
+        <w:ind w:left="425" w:hanging="255"/>
+      </w:pPr>
+      <w:r>
+        <w:rPr>
+          <w:b w:val="0"/>
+          <w:sz w:val="20"/>
+        </w:rPr>
+        <w:t xml:space="preserve">-  </w:t>
+      </w:r>
+      <w:r>
+        <w:rPr>
+          <w:b w:val="0"/>
+          <w:sz w:val="20"/>
+        </w:rPr>
+        <w:t>Confirm Download is not blocked by your browser's pop-up blocker, even after the page has been open for a while.</w:t>
+      </w:r>
+    </w:p>
+    <w:p>
+      <w:pPr>
+        <w:spacing w:after="40"/>
+        <w:ind w:left="425" w:hanging="255"/>
+      </w:pPr>
+      <w:r>
+        <w:rPr>
+          <w:b w:val="0"/>
+          <w:sz w:val="20"/>
+        </w:rPr>
+        <w:t xml:space="preserve">-  </w:t>
+      </w:r>
+      <w:r>
+        <w:rPr>
+          <w:b w:val="0"/>
+          <w:sz w:val="20"/>
+        </w:rPr>
+        <w:t>From inside the Preview window, click Send for Signature.</w:t>
       </w:r>
     </w:p>
     <w:p>
@@ -13313,27 +14053,27 @@
           <w:b w:val="0"/>
           <w:sz w:val="20"/>
         </w:rPr>
-        <w:t>PDFs and images preview in the modal; everything else prompts a download.</w:t>
-      </w:r>
-    </w:p>
-    <w:p>
-      <w:pPr>
-        <w:spacing w:after="40"/>
-        <w:ind w:left="425" w:hanging="255"/>
-      </w:pPr>
-      <w:r>
-        <w:rPr>
-          <w:b w:val="0"/>
-          <w:sz w:val="20"/>
-        </w:rPr>
-        <w:t xml:space="preserve">-  </w:t>
-      </w:r>
-      <w:r>
-        <w:rPr>
-          <w:b w:val="0"/>
-          <w:sz w:val="20"/>
-        </w:rPr>
-        <w:t>Download always saves the file.</w:t>
+        <w:t>Preview opens the document inside the page so you can read it without leaving.</w:t>
+      </w:r>
+    </w:p>
+    <w:p>
+      <w:pPr>
+        <w:spacing w:after="40"/>
+        <w:ind w:left="425" w:hanging="255"/>
+      </w:pPr>
+      <w:r>
+        <w:rPr>
+          <w:b w:val="0"/>
+          <w:sz w:val="20"/>
+        </w:rPr>
+        <w:t xml:space="preserve">-  </w:t>
+      </w:r>
+      <w:r>
+        <w:rPr>
+          <w:b w:val="0"/>
+          <w:sz w:val="20"/>
+        </w:rPr>
+        <w:t>Download opens the document in a new tab and is never blocked by the pop-up blocker.</w:t>
       </w:r>
     </w:p>
     <w:p>
@@ -14258,7 +14998,7 @@
         <w:spacing w:after="80" w:before="280"/>
       </w:pPr>
       <w:r>
-        <w:t>27.9. All Documents — Email Document, Rename, Version History</w:t>
+        <w:t>27.9. All Documents — Email Document, Edit Document (Rename / Reclassify / Reassign), Version History</w:t>
       </w:r>
     </w:p>
     <w:p>
@@ -14283,7 +15023,7 @@
           <w:b w:val="0"/>
           <w:sz w:val="20"/>
         </w:rPr>
-        <w:t>Three-dot menu on any document row (internal roles only)</w:t>
+        <w:t>Three-dot menu on any document row (internal roles only). Edit Document is also reachable from the AI Priority queue rows and the priority detail window.</w:t>
       </w:r>
     </w:p>
     <w:p>
@@ -14336,7 +15076,147 @@
           <w:b w:val="0"/>
           <w:sz w:val="20"/>
         </w:rPr>
-        <w:t>Click Rename / Reclassify. Try to save with an empty file name and confirm it is blocked. Change the file name, label, or type and click Save.</w:t>
+        <w:t>Click Edit Document. The window should show two groups of fields: Identity (file name, label, document type) and Assignment (the transaction this document belongs to).</w:t>
+      </w:r>
+    </w:p>
+    <w:p>
+      <w:pPr>
+        <w:spacing w:after="40"/>
+        <w:ind w:left="425" w:hanging="255"/>
+      </w:pPr>
+      <w:r>
+        <w:rPr>
+          <w:b w:val="0"/>
+          <w:sz w:val="20"/>
+        </w:rPr>
+        <w:t xml:space="preserve">-  </w:t>
+      </w:r>
+      <w:r>
+        <w:rPr>
+          <w:b w:val="0"/>
+          <w:sz w:val="20"/>
+        </w:rPr>
+        <w:t>Try to save with an empty file name and confirm it is blocked.</w:t>
+      </w:r>
+    </w:p>
+    <w:p>
+      <w:pPr>
+        <w:spacing w:after="40"/>
+        <w:ind w:left="425" w:hanging="255"/>
+      </w:pPr>
+      <w:r>
+        <w:rPr>
+          <w:b w:val="0"/>
+          <w:sz w:val="20"/>
+        </w:rPr>
+        <w:t xml:space="preserve">-  </w:t>
+      </w:r>
+      <w:r>
+        <w:rPr>
+          <w:b w:val="0"/>
+          <w:sz w:val="20"/>
+        </w:rPr>
+        <w:t>Change the file name, label, or type and click Save. Confirm the row updates immediately.</w:t>
+      </w:r>
+    </w:p>
+    <w:p>
+      <w:pPr>
+        <w:spacing w:after="40"/>
+        <w:ind w:left="425" w:hanging="255"/>
+      </w:pPr>
+      <w:r>
+        <w:rPr>
+          <w:b w:val="0"/>
+          <w:sz w:val="20"/>
+        </w:rPr>
+        <w:t xml:space="preserve">-  </w:t>
+      </w:r>
+      <w:r>
+        <w:rPr>
+          <w:b w:val="0"/>
+          <w:sz w:val="20"/>
+        </w:rPr>
+        <w:t>Open Edit Document again. Use the Transaction picker to move the document to a different transaction you have access to. A short note should warn you that moving the document reattaches its history and version chain.</w:t>
+      </w:r>
+    </w:p>
+    <w:p>
+      <w:pPr>
+        <w:spacing w:after="40"/>
+        <w:ind w:left="425" w:hanging="255"/>
+      </w:pPr>
+      <w:r>
+        <w:rPr>
+          <w:b w:val="0"/>
+          <w:sz w:val="20"/>
+        </w:rPr>
+        <w:t xml:space="preserve">-  </w:t>
+      </w:r>
+      <w:r>
+        <w:rPr>
+          <w:b w:val="0"/>
+          <w:sz w:val="20"/>
+        </w:rPr>
+        <w:t>Save. Confirm the document leaves the original transaction's list and now appears under the new transaction.</w:t>
+      </w:r>
+    </w:p>
+    <w:p>
+      <w:pPr>
+        <w:spacing w:after="40"/>
+        <w:ind w:left="425" w:hanging="255"/>
+      </w:pPr>
+      <w:r>
+        <w:rPr>
+          <w:b w:val="0"/>
+          <w:sz w:val="20"/>
+        </w:rPr>
+        <w:t xml:space="preserve">-  </w:t>
+      </w:r>
+      <w:r>
+        <w:rPr>
+          <w:b w:val="0"/>
+          <w:sz w:val="20"/>
+        </w:rPr>
+        <w:t>If the document was satisfying a missing requirement on the new transaction, confirm a 'Reassigned' card appears in Cleared Today.</w:t>
+      </w:r>
+    </w:p>
+    <w:p>
+      <w:pPr>
+        <w:spacing w:after="40"/>
+        <w:ind w:left="425" w:hanging="255"/>
+      </w:pPr>
+      <w:r>
+        <w:rPr>
+          <w:b w:val="0"/>
+          <w:sz w:val="20"/>
+        </w:rPr>
+        <w:t xml:space="preserve">-  </w:t>
+      </w:r>
+      <w:r>
+        <w:rPr>
+          <w:b w:val="0"/>
+          <w:sz w:val="20"/>
+        </w:rPr>
+        <w:t>Try to reassign a document that has an envelope already sent for signature, or one that is already signed. Confirm the save is blocked with a clear message asking you to void the envelope first.</w:t>
+      </w:r>
+    </w:p>
+    <w:p>
+      <w:pPr>
+        <w:spacing w:after="40"/>
+        <w:ind w:left="425" w:hanging="255"/>
+      </w:pPr>
+      <w:r>
+        <w:rPr>
+          <w:b w:val="0"/>
+          <w:sz w:val="20"/>
+        </w:rPr>
+        <w:t xml:space="preserve">-  </w:t>
+      </w:r>
+      <w:r>
+        <w:rPr>
+          <w:b w:val="0"/>
+          <w:sz w:val="20"/>
+        </w:rPr>
+        <w:t>Open Edit Document from a row in the AI Priority list (not just from the Three-dot menu on a document row). Confirm it works the same way.</w:t>
       </w:r>
     </w:p>
     <w:p>
@@ -14409,7 +15289,47 @@
           <w:b w:val="0"/>
           <w:sz w:val="20"/>
         </w:rPr>
-        <w:t>Rename / Reclassify updates the document immediately after save.</w:t>
+        <w:t>Edit Document handles renaming, reclassifying, and reassigning a document in one window. The label is the same everywhere — there is no separate 'Rename' or 'Reassign' button.</w:t>
+      </w:r>
+    </w:p>
+    <w:p>
+      <w:pPr>
+        <w:spacing w:after="40"/>
+        <w:ind w:left="425" w:hanging="255"/>
+      </w:pPr>
+      <w:r>
+        <w:rPr>
+          <w:b w:val="0"/>
+          <w:sz w:val="20"/>
+        </w:rPr>
+        <w:t xml:space="preserve">-  </w:t>
+      </w:r>
+      <w:r>
+        <w:rPr>
+          <w:b w:val="0"/>
+          <w:sz w:val="20"/>
+        </w:rPr>
+        <w:t>Reassigning the document moves it between transactions and shows up in the audit trail of both transactions.</w:t>
+      </w:r>
+    </w:p>
+    <w:p>
+      <w:pPr>
+        <w:spacing w:after="40"/>
+        <w:ind w:left="425" w:hanging="255"/>
+      </w:pPr>
+      <w:r>
+        <w:rPr>
+          <w:b w:val="0"/>
+          <w:sz w:val="20"/>
+        </w:rPr>
+        <w:t xml:space="preserve">-  </w:t>
+      </w:r>
+      <w:r>
+        <w:rPr>
+          <w:b w:val="0"/>
+          <w:sz w:val="20"/>
+        </w:rPr>
+        <w:t>An envelope-in-flight or signed document cannot be reassigned, and the system tells you exactly why.</w:t>
       </w:r>
     </w:p>
     <w:p>
@@ -14502,7 +15422,27 @@
           <w:b w:val="0"/>
           <w:sz w:val="20"/>
         </w:rPr>
-        <w:t>Use AI to suggest the right document type during Rename / Reclassify.</w:t>
+        <w:t>Use AI to suggest the right document type during Edit Document.</w:t>
+      </w:r>
+    </w:p>
+    <w:p>
+      <w:pPr>
+        <w:spacing w:after="40"/>
+        <w:ind w:left="425" w:hanging="255"/>
+      </w:pPr>
+      <w:r>
+        <w:rPr>
+          <w:b w:val="0"/>
+          <w:sz w:val="20"/>
+        </w:rPr>
+        <w:t xml:space="preserve">-  </w:t>
+      </w:r>
+      <w:r>
+        <w:rPr>
+          <w:b w:val="0"/>
+          <w:sz w:val="20"/>
+        </w:rPr>
+        <w:t>Add a 'Move all related documents' option when reassigning a document — copy / addendum / disclosure as a group.</w:t>
       </w:r>
     </w:p>
     <w:p>
@@ -14688,27 +15628,47 @@
           <w:b w:val="0"/>
           <w:sz w:val="20"/>
         </w:rPr>
-        <w:t>Confirm a confirmation dialog appears explaining the document will be soft-deleted but can be restored.</w:t>
-      </w:r>
-    </w:p>
-    <w:p>
-      <w:pPr>
-        <w:spacing w:after="40"/>
-        <w:ind w:left="425" w:hanging="255"/>
-      </w:pPr>
-      <w:r>
-        <w:rPr>
-          <w:b w:val="0"/>
-          <w:sz w:val="20"/>
-        </w:rPr>
-        <w:t xml:space="preserve">-  </w:t>
-      </w:r>
-      <w:r>
-        <w:rPr>
-          <w:b w:val="0"/>
-          <w:sz w:val="20"/>
-        </w:rPr>
-        <w:t>Click Archive and confirm the document disappears from the list and a toast confirms.</w:t>
+        <w:t>Confirm a confirmation dialog appears explaining the document will be archived and can be restored by an authorized user.</w:t>
+      </w:r>
+    </w:p>
+    <w:p>
+      <w:pPr>
+        <w:spacing w:after="40"/>
+        <w:ind w:left="425" w:hanging="255"/>
+      </w:pPr>
+      <w:r>
+        <w:rPr>
+          <w:b w:val="0"/>
+          <w:sz w:val="20"/>
+        </w:rPr>
+        <w:t xml:space="preserve">-  </w:t>
+      </w:r>
+      <w:r>
+        <w:rPr>
+          <w:b w:val="0"/>
+          <w:sz w:val="20"/>
+        </w:rPr>
+        <w:t>Click Archive and confirm the document leaves the list.</w:t>
+      </w:r>
+    </w:p>
+    <w:p>
+      <w:pPr>
+        <w:spacing w:after="40"/>
+        <w:ind w:left="425" w:hanging="255"/>
+      </w:pPr>
+      <w:r>
+        <w:rPr>
+          <w:b w:val="0"/>
+          <w:sz w:val="20"/>
+        </w:rPr>
+        <w:t xml:space="preserve">-  </w:t>
+      </w:r>
+      <w:r>
+        <w:rPr>
+          <w:b w:val="0"/>
+          <w:sz w:val="20"/>
+        </w:rPr>
+        <w:t>Open the Restore Archived panel (test 27.13) and confirm the document appears there, ready to bring back.</w:t>
       </w:r>
     </w:p>
     <w:p>
@@ -14766,6 +15726,26 @@
     </w:p>
     <w:p>
       <w:pPr>
+        <w:spacing w:after="40"/>
+        <w:ind w:left="425" w:hanging="255"/>
+      </w:pPr>
+      <w:r>
+        <w:rPr>
+          <w:b w:val="0"/>
+          <w:sz w:val="20"/>
+        </w:rPr>
+        <w:t xml:space="preserve">-  </w:t>
+      </w:r>
+      <w:r>
+        <w:rPr>
+          <w:b w:val="0"/>
+          <w:sz w:val="20"/>
+        </w:rPr>
+        <w:t>The Restore Archived panel always shows recently archived documents, so an accidental archive can be undone from there.</w:t>
+      </w:r>
+    </w:p>
+    <w:p>
+      <w:pPr>
         <w:spacing w:before="200" w:after="60"/>
       </w:pPr>
       <w:r>
@@ -14794,27 +15774,47 @@
           <w:b w:val="0"/>
           <w:sz w:val="20"/>
         </w:rPr>
-        <w:t>Add a 'Restore archived' area for admins to undo accidental archives.</w:t>
-      </w:r>
-    </w:p>
-    <w:p>
-      <w:pPr>
-        <w:spacing w:after="40"/>
-        <w:ind w:left="425" w:hanging="255"/>
-      </w:pPr>
-      <w:r>
-        <w:rPr>
-          <w:b w:val="0"/>
-          <w:sz w:val="20"/>
-        </w:rPr>
-        <w:t xml:space="preserve">-  </w:t>
-      </w:r>
-      <w:r>
-        <w:rPr>
-          <w:b w:val="0"/>
-          <w:sz w:val="20"/>
-        </w:rPr>
-        <w:t>Show an Undo toast right after archive so a single click can reverse it.</w:t>
+        <w:t>Add a one-click Undo button on the toast right after archive so the user does not have to open the Restore Archived panel for a fresh mistake.</w:t>
+      </w:r>
+    </w:p>
+    <w:p>
+      <w:pPr>
+        <w:spacing w:after="40"/>
+        <w:ind w:left="425" w:hanging="255"/>
+      </w:pPr>
+      <w:r>
+        <w:rPr>
+          <w:b w:val="0"/>
+          <w:sz w:val="20"/>
+        </w:rPr>
+        <w:t xml:space="preserve">-  </w:t>
+      </w:r>
+      <w:r>
+        <w:rPr>
+          <w:b w:val="0"/>
+          <w:sz w:val="20"/>
+        </w:rPr>
+        <w:t>Allow batch archive of several documents at once.</w:t>
+      </w:r>
+    </w:p>
+    <w:p>
+      <w:pPr>
+        <w:spacing w:after="40"/>
+        <w:ind w:left="425" w:hanging="255"/>
+      </w:pPr>
+      <w:r>
+        <w:rPr>
+          <w:b w:val="0"/>
+          <w:sz w:val="20"/>
+        </w:rPr>
+        <w:t xml:space="preserve">-  </w:t>
+      </w:r>
+      <w:r>
+        <w:rPr>
+          <w:b w:val="0"/>
+          <w:sz w:val="20"/>
+        </w:rPr>
+        <w:t>Auto-clean documents that have been archived for over 90 days, with an admin warning two weeks before.</w:t>
       </w:r>
     </w:p>
     <w:p>
@@ -14980,67 +15980,187 @@
           <w:b w:val="0"/>
           <w:sz w:val="20"/>
         </w:rPr>
-        <w:t>Sign in as Team Lead, Admin, or any other internal role and click Deletion Queue in the page header.</w:t>
-      </w:r>
-    </w:p>
-    <w:p>
-      <w:pPr>
-        <w:spacing w:after="40"/>
-        <w:ind w:left="425" w:hanging="255"/>
-      </w:pPr>
-      <w:r>
-        <w:rPr>
-          <w:b w:val="0"/>
-          <w:sz w:val="20"/>
-        </w:rPr>
-        <w:t xml:space="preserve">-  </w:t>
-      </w:r>
-      <w:r>
-        <w:rPr>
-          <w:b w:val="0"/>
-          <w:sz w:val="20"/>
-        </w:rPr>
-        <w:t>Review each pending request — confirm you can see the document name, the reason given by the requester, and an optional decision-notes field.</w:t>
-      </w:r>
-    </w:p>
-    <w:p>
-      <w:pPr>
-        <w:spacing w:after="40"/>
-        <w:ind w:left="425" w:hanging="255"/>
-      </w:pPr>
-      <w:r>
-        <w:rPr>
-          <w:b w:val="0"/>
-          <w:sz w:val="20"/>
-        </w:rPr>
-        <w:t xml:space="preserve">-  </w:t>
-      </w:r>
-      <w:r>
-        <w:rPr>
-          <w:b w:val="0"/>
-          <w:sz w:val="20"/>
-        </w:rPr>
-        <w:t>Approve one request and confirm a toast reports the document is archived.</w:t>
-      </w:r>
-    </w:p>
-    <w:p>
-      <w:pPr>
-        <w:spacing w:after="40"/>
-        <w:ind w:left="425" w:hanging="255"/>
-      </w:pPr>
-      <w:r>
-        <w:rPr>
-          <w:b w:val="0"/>
-          <w:sz w:val="20"/>
-        </w:rPr>
-        <w:t xml:space="preserve">-  </w:t>
-      </w:r>
-      <w:r>
-        <w:rPr>
-          <w:b w:val="0"/>
-          <w:sz w:val="20"/>
-        </w:rPr>
-        <w:t>Reject another request and confirm the toast reports the document stays active.</w:t>
+        <w:t>Sign in as Team Lead, Admin, or any other internal role.</w:t>
+      </w:r>
+    </w:p>
+    <w:p>
+      <w:pPr>
+        <w:spacing w:after="40"/>
+        <w:ind w:left="425" w:hanging="255"/>
+      </w:pPr>
+      <w:r>
+        <w:rPr>
+          <w:b w:val="0"/>
+          <w:sz w:val="20"/>
+        </w:rPr>
+        <w:t xml:space="preserve">-  </w:t>
+      </w:r>
+      <w:r>
+        <w:rPr>
+          <w:b w:val="0"/>
+          <w:sz w:val="20"/>
+        </w:rPr>
+        <w:t>If no clients have flagged anything yet, confirm the Deletion Queue button is not shown at all (the header stays clean).</w:t>
+      </w:r>
+    </w:p>
+    <w:p>
+      <w:pPr>
+        <w:spacing w:after="40"/>
+        <w:ind w:left="425" w:hanging="255"/>
+      </w:pPr>
+      <w:r>
+        <w:rPr>
+          <w:b w:val="0"/>
+          <w:sz w:val="20"/>
+        </w:rPr>
+        <w:t xml:space="preserve">-  </w:t>
+      </w:r>
+      <w:r>
+        <w:rPr>
+          <w:b w:val="0"/>
+          <w:sz w:val="20"/>
+        </w:rPr>
+        <w:t>When at least one document has been flagged for deletion (use 27.15 to flag one as a client / FSBO customer), confirm the Deletion Queue button now appears in the page header with a small number badge showing how many requests are waiting.</w:t>
+      </w:r>
+    </w:p>
+    <w:p>
+      <w:pPr>
+        <w:spacing w:after="40"/>
+        <w:ind w:left="425" w:hanging="255"/>
+      </w:pPr>
+      <w:r>
+        <w:rPr>
+          <w:b w:val="0"/>
+          <w:sz w:val="20"/>
+        </w:rPr>
+        <w:t xml:space="preserve">-  </w:t>
+      </w:r>
+      <w:r>
+        <w:rPr>
+          <w:b w:val="0"/>
+          <w:sz w:val="20"/>
+        </w:rPr>
+        <w:t>Confirm you also see flagged documents inside the AI Priority list as 'Review deletion request' items, with higher importance if the document has already been signed.</w:t>
+      </w:r>
+    </w:p>
+    <w:p>
+      <w:pPr>
+        <w:spacing w:after="40"/>
+        <w:ind w:left="425" w:hanging="255"/>
+      </w:pPr>
+      <w:r>
+        <w:rPr>
+          <w:b w:val="0"/>
+          <w:sz w:val="20"/>
+        </w:rPr>
+        <w:t xml:space="preserve">-  </w:t>
+      </w:r>
+      <w:r>
+        <w:rPr>
+          <w:b w:val="0"/>
+          <w:sz w:val="20"/>
+        </w:rPr>
+        <w:t>Click Deletion Queue. Review each pending request — confirm you can see the document name, the reason given by the requester, and a decision-notes field.</w:t>
+      </w:r>
+    </w:p>
+    <w:p>
+      <w:pPr>
+        <w:spacing w:after="40"/>
+        <w:ind w:left="425" w:hanging="255"/>
+      </w:pPr>
+      <w:r>
+        <w:rPr>
+          <w:b w:val="0"/>
+          <w:sz w:val="20"/>
+        </w:rPr>
+        <w:t xml:space="preserve">-  </w:t>
+      </w:r>
+      <w:r>
+        <w:rPr>
+          <w:b w:val="0"/>
+          <w:sz w:val="20"/>
+        </w:rPr>
+        <w:t>Click Approve on one request. Confirm a clear confirmation window opens before anything is archived. If the document was signed, confirm the warning says so explicitly. Click Archive document to confirm.</w:t>
+      </w:r>
+    </w:p>
+    <w:p>
+      <w:pPr>
+        <w:spacing w:after="40"/>
+        <w:ind w:left="425" w:hanging="255"/>
+      </w:pPr>
+      <w:r>
+        <w:rPr>
+          <w:b w:val="0"/>
+          <w:sz w:val="20"/>
+        </w:rPr>
+        <w:t xml:space="preserve">-  </w:t>
+      </w:r>
+      <w:r>
+        <w:rPr>
+          <w:b w:val="0"/>
+          <w:sz w:val="20"/>
+        </w:rPr>
+        <w:t>Click Reject on another request without typing a reason. Confirm you are blocked with a clear 'please enter a reason' message — Reject requires a reason so the requester knows why their request was turned down.</w:t>
+      </w:r>
+    </w:p>
+    <w:p>
+      <w:pPr>
+        <w:spacing w:after="40"/>
+        <w:ind w:left="425" w:hanging="255"/>
+      </w:pPr>
+      <w:r>
+        <w:rPr>
+          <w:b w:val="0"/>
+          <w:sz w:val="20"/>
+        </w:rPr>
+        <w:t xml:space="preserve">-  </w:t>
+      </w:r>
+      <w:r>
+        <w:rPr>
+          <w:b w:val="0"/>
+          <w:sz w:val="20"/>
+        </w:rPr>
+        <w:t>Add a reason and click Reject. Confirm the document stays in place and the request is closed.</w:t>
+      </w:r>
+    </w:p>
+    <w:p>
+      <w:pPr>
+        <w:spacing w:after="40"/>
+        <w:ind w:left="425" w:hanging="255"/>
+      </w:pPr>
+      <w:r>
+        <w:rPr>
+          <w:b w:val="0"/>
+          <w:sz w:val="20"/>
+        </w:rPr>
+        <w:t xml:space="preserve">-  </w:t>
+      </w:r>
+      <w:r>
+        <w:rPr>
+          <w:b w:val="0"/>
+          <w:sz w:val="20"/>
+        </w:rPr>
+        <w:t>Sign in as the original requester (the client / FSBO / vendor who flagged the document). Confirm they receive an in-app notification AND an email telling them the decision and the reviewer's reason.</w:t>
+      </w:r>
+    </w:p>
+    <w:p>
+      <w:pPr>
+        <w:spacing w:after="40"/>
+        <w:ind w:left="425" w:hanging="255"/>
+      </w:pPr>
+      <w:r>
+        <w:rPr>
+          <w:b w:val="0"/>
+          <w:sz w:val="20"/>
+        </w:rPr>
+        <w:t xml:space="preserve">-  </w:t>
+      </w:r>
+      <w:r>
+        <w:rPr>
+          <w:b w:val="0"/>
+          <w:sz w:val="20"/>
+        </w:rPr>
+        <w:t>Try to approve deletion of a document that has an envelope already sent for signature. Confirm the system blocks it with a message telling you to void the envelope first.</w:t>
       </w:r>
     </w:p>
     <w:p>
@@ -15073,47 +16193,67 @@
           <w:b w:val="0"/>
           <w:sz w:val="20"/>
         </w:rPr>
-        <w:t>Every flagged request from a client / FSBO / vendor appears here for an internal reviewer.</w:t>
-      </w:r>
-    </w:p>
-    <w:p>
-      <w:pPr>
-        <w:spacing w:after="40"/>
-        <w:ind w:left="425" w:hanging="255"/>
-      </w:pPr>
-      <w:r>
-        <w:rPr>
-          <w:b w:val="0"/>
-          <w:sz w:val="20"/>
-        </w:rPr>
-        <w:t xml:space="preserve">-  </w:t>
-      </w:r>
-      <w:r>
-        <w:rPr>
-          <w:b w:val="0"/>
-          <w:sz w:val="20"/>
-        </w:rPr>
-        <w:t>Approve archives the document. Reject leaves it in place.</w:t>
-      </w:r>
-    </w:p>
-    <w:p>
-      <w:pPr>
-        <w:spacing w:after="40"/>
-        <w:ind w:left="425" w:hanging="255"/>
-      </w:pPr>
-      <w:r>
-        <w:rPr>
-          <w:b w:val="0"/>
-          <w:sz w:val="20"/>
-        </w:rPr>
-        <w:t xml:space="preserve">-  </w:t>
-      </w:r>
-      <w:r>
-        <w:rPr>
-          <w:b w:val="0"/>
-          <w:sz w:val="20"/>
-        </w:rPr>
-        <w:t>Both decisions are recorded for audit.</w:t>
+        <w:t>Every flagged request from a client / FSBO / vendor appears here for an internal reviewer, and also as a priority item in the AI Priority list so it cannot be missed.</w:t>
+      </w:r>
+    </w:p>
+    <w:p>
+      <w:pPr>
+        <w:spacing w:after="40"/>
+        <w:ind w:left="425" w:hanging="255"/>
+      </w:pPr>
+      <w:r>
+        <w:rPr>
+          <w:b w:val="0"/>
+          <w:sz w:val="20"/>
+        </w:rPr>
+        <w:t xml:space="preserve">-  </w:t>
+      </w:r>
+      <w:r>
+        <w:rPr>
+          <w:b w:val="0"/>
+          <w:sz w:val="20"/>
+        </w:rPr>
+        <w:t>The button only shows up when there is work to do — the badge tells you how many requests are waiting.</w:t>
+      </w:r>
+    </w:p>
+    <w:p>
+      <w:pPr>
+        <w:spacing w:after="40"/>
+        <w:ind w:left="425" w:hanging="255"/>
+      </w:pPr>
+      <w:r>
+        <w:rPr>
+          <w:b w:val="0"/>
+          <w:sz w:val="20"/>
+        </w:rPr>
+        <w:t xml:space="preserve">-  </w:t>
+      </w:r>
+      <w:r>
+        <w:rPr>
+          <w:b w:val="0"/>
+          <w:sz w:val="20"/>
+        </w:rPr>
+        <w:t>Approve always requires an explicit confirmation step. Reject always requires a reason.</w:t>
+      </w:r>
+    </w:p>
+    <w:p>
+      <w:pPr>
+        <w:spacing w:after="40"/>
+        <w:ind w:left="425" w:hanging="255"/>
+      </w:pPr>
+      <w:r>
+        <w:rPr>
+          <w:b w:val="0"/>
+          <w:sz w:val="20"/>
+        </w:rPr>
+        <w:t xml:space="preserve">-  </w:t>
+      </w:r>
+      <w:r>
+        <w:rPr>
+          <w:b w:val="0"/>
+          <w:sz w:val="20"/>
+        </w:rPr>
+        <w:t>Both decisions are recorded for audit, and the requester always hears back by notification and email.</w:t>
       </w:r>
     </w:p>
     <w:p>
@@ -15146,27 +16286,27 @@
           <w:b w:val="0"/>
           <w:sz w:val="20"/>
         </w:rPr>
-        <w:t>Email the original requester automatically when a decision is made.</w:t>
-      </w:r>
-    </w:p>
-    <w:p>
-      <w:pPr>
-        <w:spacing w:after="40"/>
-        <w:ind w:left="425" w:hanging="255"/>
-      </w:pPr>
-      <w:r>
-        <w:rPr>
-          <w:b w:val="0"/>
-          <w:sz w:val="20"/>
-        </w:rPr>
-        <w:t xml:space="preserve">-  </w:t>
-      </w:r>
-      <w:r>
-        <w:rPr>
-          <w:b w:val="0"/>
-          <w:sz w:val="20"/>
-        </w:rPr>
         <w:t>Add bulk approve / bulk reject for high-volume cleanup.</w:t>
+      </w:r>
+    </w:p>
+    <w:p>
+      <w:pPr>
+        <w:spacing w:after="40"/>
+        <w:ind w:left="425" w:hanging="255"/>
+      </w:pPr>
+      <w:r>
+        <w:rPr>
+          <w:b w:val="0"/>
+          <w:sz w:val="20"/>
+        </w:rPr>
+        <w:t xml:space="preserve">-  </w:t>
+      </w:r>
+      <w:r>
+        <w:rPr>
+          <w:b w:val="0"/>
+          <w:sz w:val="20"/>
+        </w:rPr>
+        <w:t>Show the requester their previous flag history if they have flagged several documents in a short period.</w:t>
       </w:r>
     </w:p>
     <w:p>
@@ -15519,6 +16659,1322 @@
           <w:sz w:val="20"/>
         </w:rPr>
         <w:t>Detect popup-blocked browsers up front and offer a redirect flow instead.</w:t>
+      </w:r>
+    </w:p>
+    <w:p>
+      <w:pPr>
+        <w:spacing w:before="200" w:after="60"/>
+      </w:pPr>
+      <w:r>
+        <w:rPr>
+          <w:b/>
+          <w:color w:val="C0504D"/>
+          <w:sz w:val="22"/>
+        </w:rPr>
+        <w:t>Feedback</w:t>
+      </w:r>
+    </w:p>
+    <w:p>
+      <w:pPr>
+        <w:spacing w:after="80"/>
+      </w:pPr>
+      <w:r>
+        <w:rPr>
+          <w:i/>
+          <w:color w:val="555555"/>
+          <w:sz w:val="18"/>
+        </w:rPr>
+        <w:t>Please note below: Status (Pass / Fail / Needs Work), any comments or issues you hit, and your priority for the improvement ideas above (High / Medium / Low / Skip).</w:t>
+      </w:r>
+    </w:p>
+    <w:p>
+      <w:pPr>
+        <w:spacing w:after="120"/>
+      </w:pPr>
+      <w:r>
+        <w:rPr>
+          <w:color w:val="BBBBBB"/>
+          <w:sz w:val="20"/>
+        </w:rPr>
+        <w:t>__________________________________________________________________________________________</w:t>
+      </w:r>
+    </w:p>
+    <w:p>
+      <w:pPr>
+        <w:spacing w:after="120"/>
+      </w:pPr>
+      <w:r>
+        <w:rPr>
+          <w:color w:val="BBBBBB"/>
+          <w:sz w:val="20"/>
+        </w:rPr>
+        <w:t>__________________________________________________________________________________________</w:t>
+      </w:r>
+    </w:p>
+    <w:p>
+      <w:pPr>
+        <w:spacing w:after="120"/>
+      </w:pPr>
+      <w:r>
+        <w:rPr>
+          <w:color w:val="BBBBBB"/>
+          <w:sz w:val="20"/>
+        </w:rPr>
+        <w:t>__________________________________________________________________________________________</w:t>
+      </w:r>
+    </w:p>
+    <w:p>
+      <w:pPr>
+        <w:spacing w:after="120"/>
+      </w:pPr>
+      <w:r>
+        <w:rPr>
+          <w:color w:val="BBBBBB"/>
+          <w:sz w:val="20"/>
+        </w:rPr>
+        <w:t>__________________________________________________________________________________________</w:t>
+      </w:r>
+    </w:p>
+    <w:p>
+      <w:pPr>
+        <w:spacing w:after="120"/>
+      </w:pPr>
+      <w:r>
+        <w:rPr>
+          <w:color w:val="BBBBBB"/>
+          <w:sz w:val="20"/>
+        </w:rPr>
+        <w:t>__________________________________________________________________________________________</w:t>
+      </w:r>
+    </w:p>
+    <w:p>
+      <w:pPr>
+        <w:spacing w:after="120"/>
+      </w:pPr>
+      <w:r>
+        <w:rPr>
+          <w:color w:val="BBBBBB"/>
+          <w:sz w:val="20"/>
+        </w:rPr>
+        <w:t>__________________________________________________________________________________________</w:t>
+      </w:r>
+    </w:p>
+    <w:p/>
+    <w:p>
+      <w:pPr>
+        <w:pStyle w:val="Heading2"/>
+        <w:spacing w:after="80" w:before="280"/>
+      </w:pPr>
+      <w:r>
+        <w:t>27.13. All Documents — Restore Archived</w:t>
+      </w:r>
+    </w:p>
+    <w:p>
+      <w:pPr>
+        <w:spacing w:before="200" w:after="60"/>
+      </w:pPr>
+      <w:r>
+        <w:rPr>
+          <w:b/>
+          <w:color w:val="1F3A5F"/>
+          <w:sz w:val="22"/>
+        </w:rPr>
+        <w:t>Route / Location</w:t>
+      </w:r>
+    </w:p>
+    <w:p>
+      <w:pPr>
+        <w:spacing w:after="40"/>
+      </w:pPr>
+      <w:r>
+        <w:rPr>
+          <w:b w:val="0"/>
+          <w:sz w:val="20"/>
+        </w:rPr>
+        <w:t>'Restore archived' button in the page header on /documents (internal roles only)</w:t>
+      </w:r>
+    </w:p>
+    <w:p>
+      <w:pPr>
+        <w:spacing w:before="200" w:after="60"/>
+      </w:pPr>
+      <w:r>
+        <w:rPr>
+          <w:b/>
+          <w:color w:val="1F3A5F"/>
+          <w:sz w:val="22"/>
+        </w:rPr>
+        <w:t>How To Test</w:t>
+      </w:r>
+    </w:p>
+    <w:p>
+      <w:pPr>
+        <w:spacing w:after="40"/>
+        <w:ind w:left="425" w:hanging="255"/>
+      </w:pPr>
+      <w:r>
+        <w:rPr>
+          <w:b w:val="0"/>
+          <w:sz w:val="20"/>
+        </w:rPr>
+        <w:t xml:space="preserve">-  </w:t>
+      </w:r>
+      <w:r>
+        <w:rPr>
+          <w:b w:val="0"/>
+          <w:sz w:val="20"/>
+        </w:rPr>
+        <w:t>Archive one or two documents from the three-dot menu on a row (see test 27.10).</w:t>
+      </w:r>
+    </w:p>
+    <w:p>
+      <w:pPr>
+        <w:spacing w:after="40"/>
+        <w:ind w:left="425" w:hanging="255"/>
+      </w:pPr>
+      <w:r>
+        <w:rPr>
+          <w:b w:val="0"/>
+          <w:sz w:val="20"/>
+        </w:rPr>
+        <w:t xml:space="preserve">-  </w:t>
+      </w:r>
+      <w:r>
+        <w:rPr>
+          <w:b w:val="0"/>
+          <w:sz w:val="20"/>
+        </w:rPr>
+        <w:t>Click the Restore archived button in the page header (it sits next to Send for Sig and Upload).</w:t>
+      </w:r>
+    </w:p>
+    <w:p>
+      <w:pPr>
+        <w:spacing w:after="40"/>
+        <w:ind w:left="425" w:hanging="255"/>
+      </w:pPr>
+      <w:r>
+        <w:rPr>
+          <w:b w:val="0"/>
+          <w:sz w:val="20"/>
+        </w:rPr>
+        <w:t xml:space="preserve">-  </w:t>
+      </w:r>
+      <w:r>
+        <w:rPr>
+          <w:b w:val="0"/>
+          <w:sz w:val="20"/>
+        </w:rPr>
+        <w:t>Confirm a panel opens listing recently archived documents.</w:t>
+      </w:r>
+    </w:p>
+    <w:p>
+      <w:pPr>
+        <w:spacing w:after="40"/>
+        <w:ind w:left="425" w:hanging="255"/>
+      </w:pPr>
+      <w:r>
+        <w:rPr>
+          <w:b w:val="0"/>
+          <w:sz w:val="20"/>
+        </w:rPr>
+        <w:t xml:space="preserve">-  </w:t>
+      </w:r>
+      <w:r>
+        <w:rPr>
+          <w:b w:val="0"/>
+          <w:sz w:val="20"/>
+        </w:rPr>
+        <w:t>Confirm each row shows the document name and the date it was archived.</w:t>
+      </w:r>
+    </w:p>
+    <w:p>
+      <w:pPr>
+        <w:spacing w:after="40"/>
+        <w:ind w:left="425" w:hanging="255"/>
+      </w:pPr>
+      <w:r>
+        <w:rPr>
+          <w:b w:val="0"/>
+          <w:sz w:val="20"/>
+        </w:rPr>
+        <w:t xml:space="preserve">-  </w:t>
+      </w:r>
+      <w:r>
+        <w:rPr>
+          <w:b w:val="0"/>
+          <w:sz w:val="20"/>
+        </w:rPr>
+        <w:t>Click Restore on a row. Confirm the document comes back to the active list and the row leaves the Restore Archived panel.</w:t>
+      </w:r>
+    </w:p>
+    <w:p>
+      <w:pPr>
+        <w:spacing w:before="200" w:after="60"/>
+      </w:pPr>
+      <w:r>
+        <w:rPr>
+          <w:b/>
+          <w:color w:val="1F3A5F"/>
+          <w:sz w:val="22"/>
+        </w:rPr>
+        <w:t>Expected Result</w:t>
+      </w:r>
+    </w:p>
+    <w:p>
+      <w:pPr>
+        <w:spacing w:after="40"/>
+        <w:ind w:left="425" w:hanging="255"/>
+      </w:pPr>
+      <w:r>
+        <w:rPr>
+          <w:b w:val="0"/>
+          <w:sz w:val="20"/>
+        </w:rPr>
+        <w:t xml:space="preserve">-  </w:t>
+      </w:r>
+      <w:r>
+        <w:rPr>
+          <w:b w:val="0"/>
+          <w:sz w:val="20"/>
+        </w:rPr>
+        <w:t>Recently archived documents can be restored from this panel without contacting an admin.</w:t>
+      </w:r>
+    </w:p>
+    <w:p>
+      <w:pPr>
+        <w:spacing w:after="40"/>
+        <w:ind w:left="425" w:hanging="255"/>
+      </w:pPr>
+      <w:r>
+        <w:rPr>
+          <w:b w:val="0"/>
+          <w:sz w:val="20"/>
+        </w:rPr>
+        <w:t xml:space="preserve">-  </w:t>
+      </w:r>
+      <w:r>
+        <w:rPr>
+          <w:b w:val="0"/>
+          <w:sz w:val="20"/>
+        </w:rPr>
+        <w:t>Restoring a document brings it back exactly where it was — same transaction, same version history.</w:t>
+      </w:r>
+    </w:p>
+    <w:p>
+      <w:pPr>
+        <w:spacing w:before="200" w:after="60"/>
+      </w:pPr>
+      <w:r>
+        <w:rPr>
+          <w:b/>
+          <w:color w:val="1F3A5F"/>
+          <w:sz w:val="22"/>
+        </w:rPr>
+        <w:t>Future Improvement Suggestions</w:t>
+      </w:r>
+    </w:p>
+    <w:p>
+      <w:pPr>
+        <w:spacing w:after="40"/>
+        <w:ind w:left="425" w:hanging="255"/>
+      </w:pPr>
+      <w:r>
+        <w:rPr>
+          <w:b w:val="0"/>
+          <w:sz w:val="20"/>
+        </w:rPr>
+        <w:t xml:space="preserve">-  </w:t>
+      </w:r>
+      <w:r>
+        <w:rPr>
+          <w:b w:val="0"/>
+          <w:sz w:val="20"/>
+        </w:rPr>
+        <w:t>Show who archived the document and the reason, so the reviewer can decide whether to restore.</w:t>
+      </w:r>
+    </w:p>
+    <w:p>
+      <w:pPr>
+        <w:spacing w:after="40"/>
+        <w:ind w:left="425" w:hanging="255"/>
+      </w:pPr>
+      <w:r>
+        <w:rPr>
+          <w:b w:val="0"/>
+          <w:sz w:val="20"/>
+        </w:rPr>
+        <w:t xml:space="preserve">-  </w:t>
+      </w:r>
+      <w:r>
+        <w:rPr>
+          <w:b w:val="0"/>
+          <w:sz w:val="20"/>
+        </w:rPr>
+        <w:t>Allow searching the panel by document name or transaction address for tenants with a lot of archived documents.</w:t>
+      </w:r>
+    </w:p>
+    <w:p>
+      <w:pPr>
+        <w:spacing w:after="40"/>
+        <w:ind w:left="425" w:hanging="255"/>
+      </w:pPr>
+      <w:r>
+        <w:rPr>
+          <w:b w:val="0"/>
+          <w:sz w:val="20"/>
+        </w:rPr>
+        <w:t xml:space="preserve">-  </w:t>
+      </w:r>
+      <w:r>
+        <w:rPr>
+          <w:b w:val="0"/>
+          <w:sz w:val="20"/>
+        </w:rPr>
+        <w:t>Add a 'Restored by' note to the document's history so the audit trail is complete.</w:t>
+      </w:r>
+    </w:p>
+    <w:p>
+      <w:pPr>
+        <w:spacing w:before="200" w:after="60"/>
+      </w:pPr>
+      <w:r>
+        <w:rPr>
+          <w:b/>
+          <w:color w:val="C0504D"/>
+          <w:sz w:val="22"/>
+        </w:rPr>
+        <w:t>Feedback</w:t>
+      </w:r>
+    </w:p>
+    <w:p>
+      <w:pPr>
+        <w:spacing w:after="80"/>
+      </w:pPr>
+      <w:r>
+        <w:rPr>
+          <w:i/>
+          <w:color w:val="555555"/>
+          <w:sz w:val="18"/>
+        </w:rPr>
+        <w:t>Please note below: Status (Pass / Fail / Needs Work), any comments or issues you hit, and your priority for the improvement ideas above (High / Medium / Low / Skip).</w:t>
+      </w:r>
+    </w:p>
+    <w:p>
+      <w:pPr>
+        <w:spacing w:after="120"/>
+      </w:pPr>
+      <w:r>
+        <w:rPr>
+          <w:color w:val="BBBBBB"/>
+          <w:sz w:val="20"/>
+        </w:rPr>
+        <w:t>__________________________________________________________________________________________</w:t>
+      </w:r>
+    </w:p>
+    <w:p>
+      <w:pPr>
+        <w:spacing w:after="120"/>
+      </w:pPr>
+      <w:r>
+        <w:rPr>
+          <w:color w:val="BBBBBB"/>
+          <w:sz w:val="20"/>
+        </w:rPr>
+        <w:t>__________________________________________________________________________________________</w:t>
+      </w:r>
+    </w:p>
+    <w:p>
+      <w:pPr>
+        <w:spacing w:after="120"/>
+      </w:pPr>
+      <w:r>
+        <w:rPr>
+          <w:color w:val="BBBBBB"/>
+          <w:sz w:val="20"/>
+        </w:rPr>
+        <w:t>__________________________________________________________________________________________</w:t>
+      </w:r>
+    </w:p>
+    <w:p>
+      <w:pPr>
+        <w:spacing w:after="120"/>
+      </w:pPr>
+      <w:r>
+        <w:rPr>
+          <w:color w:val="BBBBBB"/>
+          <w:sz w:val="20"/>
+        </w:rPr>
+        <w:t>__________________________________________________________________________________________</w:t>
+      </w:r>
+    </w:p>
+    <w:p>
+      <w:pPr>
+        <w:spacing w:after="120"/>
+      </w:pPr>
+      <w:r>
+        <w:rPr>
+          <w:color w:val="BBBBBB"/>
+          <w:sz w:val="20"/>
+        </w:rPr>
+        <w:t>__________________________________________________________________________________________</w:t>
+      </w:r>
+    </w:p>
+    <w:p>
+      <w:pPr>
+        <w:spacing w:after="120"/>
+      </w:pPr>
+      <w:r>
+        <w:rPr>
+          <w:color w:val="BBBBBB"/>
+          <w:sz w:val="20"/>
+        </w:rPr>
+        <w:t>__________________________________________________________________________________________</w:t>
+      </w:r>
+    </w:p>
+    <w:p/>
+    <w:p>
+      <w:pPr>
+        <w:pStyle w:val="Heading2"/>
+        <w:spacing w:after="80" w:before="280"/>
+      </w:pPr>
+      <w:r>
+        <w:t>27.14. All Documents — Bulk actions on the Missing tab</w:t>
+      </w:r>
+    </w:p>
+    <w:p>
+      <w:pPr>
+        <w:spacing w:before="200" w:after="60"/>
+      </w:pPr>
+      <w:r>
+        <w:rPr>
+          <w:b/>
+          <w:color w:val="1F3A5F"/>
+          <w:sz w:val="22"/>
+        </w:rPr>
+        <w:t>Route / Location</w:t>
+      </w:r>
+    </w:p>
+    <w:p>
+      <w:pPr>
+        <w:spacing w:after="40"/>
+      </w:pPr>
+      <w:r>
+        <w:rPr>
+          <w:b w:val="0"/>
+          <w:sz w:val="20"/>
+        </w:rPr>
+        <w:t>/documents (Missing tab)</w:t>
+      </w:r>
+    </w:p>
+    <w:p>
+      <w:pPr>
+        <w:spacing w:before="200" w:after="60"/>
+      </w:pPr>
+      <w:r>
+        <w:rPr>
+          <w:b/>
+          <w:color w:val="1F3A5F"/>
+          <w:sz w:val="22"/>
+        </w:rPr>
+        <w:t>How To Test</w:t>
+      </w:r>
+    </w:p>
+    <w:p>
+      <w:pPr>
+        <w:spacing w:after="40"/>
+        <w:ind w:left="425" w:hanging="255"/>
+      </w:pPr>
+      <w:r>
+        <w:rPr>
+          <w:b w:val="0"/>
+          <w:sz w:val="20"/>
+        </w:rPr>
+        <w:t xml:space="preserve">-  </w:t>
+      </w:r>
+      <w:r>
+        <w:rPr>
+          <w:b w:val="0"/>
+          <w:sz w:val="20"/>
+        </w:rPr>
+        <w:t>Open the Missing tab. Each row should have a small checkbox at the left edge.</w:t>
+      </w:r>
+    </w:p>
+    <w:p>
+      <w:pPr>
+        <w:spacing w:after="40"/>
+        <w:ind w:left="425" w:hanging="255"/>
+      </w:pPr>
+      <w:r>
+        <w:rPr>
+          <w:b w:val="0"/>
+          <w:sz w:val="20"/>
+        </w:rPr>
+        <w:t xml:space="preserve">-  </w:t>
+      </w:r>
+      <w:r>
+        <w:rPr>
+          <w:b w:val="0"/>
+          <w:sz w:val="20"/>
+        </w:rPr>
+        <w:t>Tick the checkboxes on two or three rows. A bulk-action bar should appear above the list showing 'N items selected'.</w:t>
+      </w:r>
+    </w:p>
+    <w:p>
+      <w:pPr>
+        <w:spacing w:after="40"/>
+        <w:ind w:left="425" w:hanging="255"/>
+      </w:pPr>
+      <w:r>
+        <w:rPr>
+          <w:b w:val="0"/>
+          <w:sz w:val="20"/>
+        </w:rPr>
+        <w:t xml:space="preserve">-  </w:t>
+      </w:r>
+      <w:r>
+        <w:rPr>
+          <w:b w:val="0"/>
+          <w:sz w:val="20"/>
+        </w:rPr>
+        <w:t>From the bulk-action bar click Mark N/A. Confirm all selected rows clear at once.</w:t>
+      </w:r>
+    </w:p>
+    <w:p>
+      <w:pPr>
+        <w:spacing w:after="40"/>
+        <w:ind w:left="425" w:hanging="255"/>
+      </w:pPr>
+      <w:r>
+        <w:rPr>
+          <w:b w:val="0"/>
+          <w:sz w:val="20"/>
+        </w:rPr>
+        <w:t xml:space="preserve">-  </w:t>
+      </w:r>
+      <w:r>
+        <w:rPr>
+          <w:b w:val="0"/>
+          <w:sz w:val="20"/>
+        </w:rPr>
+        <w:t>Select two or three more rows and click Request. Confirm a request email window opens for the first selected row (the system asks one recipient at a time — sending one email to several different recipients at once is not yet supported).</w:t>
+      </w:r>
+    </w:p>
+    <w:p>
+      <w:pPr>
+        <w:spacing w:after="40"/>
+        <w:ind w:left="425" w:hanging="255"/>
+      </w:pPr>
+      <w:r>
+        <w:rPr>
+          <w:b w:val="0"/>
+          <w:sz w:val="20"/>
+        </w:rPr>
+        <w:t xml:space="preserve">-  </w:t>
+      </w:r>
+      <w:r>
+        <w:rPr>
+          <w:b w:val="0"/>
+          <w:sz w:val="20"/>
+        </w:rPr>
+        <w:t>Select rows and click Upload / Assign. Confirm the Upload window opens with the first selected row's transaction and document type already filled in.</w:t>
+      </w:r>
+    </w:p>
+    <w:p>
+      <w:pPr>
+        <w:spacing w:after="40"/>
+        <w:ind w:left="425" w:hanging="255"/>
+      </w:pPr>
+      <w:r>
+        <w:rPr>
+          <w:b w:val="0"/>
+          <w:sz w:val="20"/>
+        </w:rPr>
+        <w:t xml:space="preserve">-  </w:t>
+      </w:r>
+      <w:r>
+        <w:rPr>
+          <w:b w:val="0"/>
+          <w:sz w:val="20"/>
+        </w:rPr>
+        <w:t>Click Clear on the bulk-action bar. Confirm the bar disappears and no rows stay selected.</w:t>
+      </w:r>
+    </w:p>
+    <w:p>
+      <w:pPr>
+        <w:spacing w:after="40"/>
+        <w:ind w:left="425" w:hanging="255"/>
+      </w:pPr>
+      <w:r>
+        <w:rPr>
+          <w:b w:val="0"/>
+          <w:sz w:val="20"/>
+        </w:rPr>
+        <w:t xml:space="preserve">-  </w:t>
+      </w:r>
+      <w:r>
+        <w:rPr>
+          <w:b w:val="0"/>
+          <w:sz w:val="20"/>
+        </w:rPr>
+        <w:t>Confirm the bulk-action bar is only shown when at least one row is selected — no checked rows, no bar.</w:t>
+      </w:r>
+    </w:p>
+    <w:p>
+      <w:pPr>
+        <w:spacing w:before="200" w:after="60"/>
+      </w:pPr>
+      <w:r>
+        <w:rPr>
+          <w:b/>
+          <w:color w:val="1F3A5F"/>
+          <w:sz w:val="22"/>
+        </w:rPr>
+        <w:t>Expected Result</w:t>
+      </w:r>
+    </w:p>
+    <w:p>
+      <w:pPr>
+        <w:spacing w:after="40"/>
+        <w:ind w:left="425" w:hanging="255"/>
+      </w:pPr>
+      <w:r>
+        <w:rPr>
+          <w:b w:val="0"/>
+          <w:sz w:val="20"/>
+        </w:rPr>
+        <w:t xml:space="preserve">-  </w:t>
+      </w:r>
+      <w:r>
+        <w:rPr>
+          <w:b w:val="0"/>
+          <w:sz w:val="20"/>
+        </w:rPr>
+        <w:t>Multi-select is only offered on the Missing tab — other tabs do not show row checkboxes.</w:t>
+      </w:r>
+    </w:p>
+    <w:p>
+      <w:pPr>
+        <w:spacing w:after="40"/>
+        <w:ind w:left="425" w:hanging="255"/>
+      </w:pPr>
+      <w:r>
+        <w:rPr>
+          <w:b w:val="0"/>
+          <w:sz w:val="20"/>
+        </w:rPr>
+        <w:t xml:space="preserve">-  </w:t>
+      </w:r>
+      <w:r>
+        <w:rPr>
+          <w:b w:val="0"/>
+          <w:sz w:val="20"/>
+        </w:rPr>
+        <w:t>Mark N/A runs on every selected row at once.</w:t>
+      </w:r>
+    </w:p>
+    <w:p>
+      <w:pPr>
+        <w:spacing w:after="40"/>
+        <w:ind w:left="425" w:hanging="255"/>
+      </w:pPr>
+      <w:r>
+        <w:rPr>
+          <w:b w:val="0"/>
+          <w:sz w:val="20"/>
+        </w:rPr>
+        <w:t xml:space="preserve">-  </w:t>
+      </w:r>
+      <w:r>
+        <w:rPr>
+          <w:b w:val="0"/>
+          <w:sz w:val="20"/>
+        </w:rPr>
+        <w:t>Request and Upload / Assign use the first selected row to pre-fill their modal — they do not yet send to several recipients at once.</w:t>
+      </w:r>
+    </w:p>
+    <w:p>
+      <w:pPr>
+        <w:spacing w:after="40"/>
+        <w:ind w:left="425" w:hanging="255"/>
+      </w:pPr>
+      <w:r>
+        <w:rPr>
+          <w:b w:val="0"/>
+          <w:sz w:val="20"/>
+        </w:rPr>
+        <w:t xml:space="preserve">-  </w:t>
+      </w:r>
+      <w:r>
+        <w:rPr>
+          <w:b w:val="0"/>
+          <w:sz w:val="20"/>
+        </w:rPr>
+        <w:t>There is no bulk Reassign on the Missing tab — there's no existing document to move yet.</w:t>
+      </w:r>
+    </w:p>
+    <w:p>
+      <w:pPr>
+        <w:spacing w:before="200" w:after="60"/>
+      </w:pPr>
+      <w:r>
+        <w:rPr>
+          <w:b/>
+          <w:color w:val="1F3A5F"/>
+          <w:sz w:val="22"/>
+        </w:rPr>
+        <w:t>Future Improvement Suggestions</w:t>
+      </w:r>
+    </w:p>
+    <w:p>
+      <w:pPr>
+        <w:spacing w:after="40"/>
+        <w:ind w:left="425" w:hanging="255"/>
+      </w:pPr>
+      <w:r>
+        <w:rPr>
+          <w:b w:val="0"/>
+          <w:sz w:val="20"/>
+        </w:rPr>
+        <w:t xml:space="preserve">-  </w:t>
+      </w:r>
+      <w:r>
+        <w:rPr>
+          <w:b w:val="0"/>
+          <w:sz w:val="20"/>
+        </w:rPr>
+        <w:t>Allow Request to send to several different recipients in one pass.</w:t>
+      </w:r>
+    </w:p>
+    <w:p>
+      <w:pPr>
+        <w:spacing w:after="40"/>
+        <w:ind w:left="425" w:hanging="255"/>
+      </w:pPr>
+      <w:r>
+        <w:rPr>
+          <w:b w:val="0"/>
+          <w:sz w:val="20"/>
+        </w:rPr>
+        <w:t xml:space="preserve">-  </w:t>
+      </w:r>
+      <w:r>
+        <w:rPr>
+          <w:b w:val="0"/>
+          <w:sz w:val="20"/>
+        </w:rPr>
+        <w:t>Add a Select-all checkbox at the top of the list.</w:t>
+      </w:r>
+    </w:p>
+    <w:p>
+      <w:pPr>
+        <w:spacing w:after="40"/>
+        <w:ind w:left="425" w:hanging="255"/>
+      </w:pPr>
+      <w:r>
+        <w:rPr>
+          <w:b w:val="0"/>
+          <w:sz w:val="20"/>
+        </w:rPr>
+        <w:t xml:space="preserve">-  </w:t>
+      </w:r>
+      <w:r>
+        <w:rPr>
+          <w:b w:val="0"/>
+          <w:sz w:val="20"/>
+        </w:rPr>
+        <w:t>Add a 'Select rows by transaction' shortcut so the user can clear an entire deal in two clicks.</w:t>
+      </w:r>
+    </w:p>
+    <w:p>
+      <w:pPr>
+        <w:spacing w:after="40"/>
+        <w:ind w:left="425" w:hanging="255"/>
+      </w:pPr>
+      <w:r>
+        <w:rPr>
+          <w:b w:val="0"/>
+          <w:sz w:val="20"/>
+        </w:rPr>
+        <w:t xml:space="preserve">-  </w:t>
+      </w:r>
+      <w:r>
+        <w:rPr>
+          <w:b w:val="0"/>
+          <w:sz w:val="20"/>
+        </w:rPr>
+        <w:t>Add bulk Reassign on the All Docs and Pending Review tabs once that surface is ready.</w:t>
+      </w:r>
+    </w:p>
+    <w:p>
+      <w:pPr>
+        <w:spacing w:before="200" w:after="60"/>
+      </w:pPr>
+      <w:r>
+        <w:rPr>
+          <w:b/>
+          <w:color w:val="C0504D"/>
+          <w:sz w:val="22"/>
+        </w:rPr>
+        <w:t>Feedback</w:t>
+      </w:r>
+    </w:p>
+    <w:p>
+      <w:pPr>
+        <w:spacing w:after="80"/>
+      </w:pPr>
+      <w:r>
+        <w:rPr>
+          <w:i/>
+          <w:color w:val="555555"/>
+          <w:sz w:val="18"/>
+        </w:rPr>
+        <w:t>Please note below: Status (Pass / Fail / Needs Work), any comments or issues you hit, and your priority for the improvement ideas above (High / Medium / Low / Skip).</w:t>
+      </w:r>
+    </w:p>
+    <w:p>
+      <w:pPr>
+        <w:spacing w:after="120"/>
+      </w:pPr>
+      <w:r>
+        <w:rPr>
+          <w:color w:val="BBBBBB"/>
+          <w:sz w:val="20"/>
+        </w:rPr>
+        <w:t>__________________________________________________________________________________________</w:t>
+      </w:r>
+    </w:p>
+    <w:p>
+      <w:pPr>
+        <w:spacing w:after="120"/>
+      </w:pPr>
+      <w:r>
+        <w:rPr>
+          <w:color w:val="BBBBBB"/>
+          <w:sz w:val="20"/>
+        </w:rPr>
+        <w:t>__________________________________________________________________________________________</w:t>
+      </w:r>
+    </w:p>
+    <w:p>
+      <w:pPr>
+        <w:spacing w:after="120"/>
+      </w:pPr>
+      <w:r>
+        <w:rPr>
+          <w:color w:val="BBBBBB"/>
+          <w:sz w:val="20"/>
+        </w:rPr>
+        <w:t>__________________________________________________________________________________________</w:t>
+      </w:r>
+    </w:p>
+    <w:p>
+      <w:pPr>
+        <w:spacing w:after="120"/>
+      </w:pPr>
+      <w:r>
+        <w:rPr>
+          <w:color w:val="BBBBBB"/>
+          <w:sz w:val="20"/>
+        </w:rPr>
+        <w:t>__________________________________________________________________________________________</w:t>
+      </w:r>
+    </w:p>
+    <w:p>
+      <w:pPr>
+        <w:spacing w:after="120"/>
+      </w:pPr>
+      <w:r>
+        <w:rPr>
+          <w:color w:val="BBBBBB"/>
+          <w:sz w:val="20"/>
+        </w:rPr>
+        <w:t>__________________________________________________________________________________________</w:t>
+      </w:r>
+    </w:p>
+    <w:p>
+      <w:pPr>
+        <w:spacing w:after="120"/>
+      </w:pPr>
+      <w:r>
+        <w:rPr>
+          <w:color w:val="BBBBBB"/>
+          <w:sz w:val="20"/>
+        </w:rPr>
+        <w:t>__________________________________________________________________________________________</w:t>
+      </w:r>
+    </w:p>
+    <w:p/>
+    <w:p>
+      <w:pPr>
+        <w:pStyle w:val="Heading2"/>
+        <w:spacing w:after="80" w:before="280"/>
+      </w:pPr>
+      <w:r>
+        <w:t>27.15. Client / FSBO Documents portal — view and flag a document for deletion</w:t>
+      </w:r>
+    </w:p>
+    <w:p>
+      <w:pPr>
+        <w:spacing w:before="200" w:after="60"/>
+      </w:pPr>
+      <w:r>
+        <w:rPr>
+          <w:b/>
+          <w:color w:val="1F3A5F"/>
+          <w:sz w:val="22"/>
+        </w:rPr>
+        <w:t>Route / Location</w:t>
+      </w:r>
+    </w:p>
+    <w:p>
+      <w:pPr>
+        <w:spacing w:after="40"/>
+      </w:pPr>
+      <w:r>
+        <w:rPr>
+          <w:b w:val="0"/>
+          <w:sz w:val="20"/>
+        </w:rPr>
+        <w:t>/client/documents (Client) or /fsbo/documents (FSBO Customer)</w:t>
+      </w:r>
+    </w:p>
+    <w:p>
+      <w:pPr>
+        <w:spacing w:before="200" w:after="60"/>
+      </w:pPr>
+      <w:r>
+        <w:rPr>
+          <w:b/>
+          <w:color w:val="1F3A5F"/>
+          <w:sz w:val="22"/>
+        </w:rPr>
+        <w:t>How To Test</w:t>
+      </w:r>
+    </w:p>
+    <w:p>
+      <w:pPr>
+        <w:spacing w:after="40"/>
+        <w:ind w:left="425" w:hanging="255"/>
+      </w:pPr>
+      <w:r>
+        <w:rPr>
+          <w:b w:val="0"/>
+          <w:sz w:val="20"/>
+        </w:rPr>
+        <w:t xml:space="preserve">-  </w:t>
+      </w:r>
+      <w:r>
+        <w:rPr>
+          <w:b w:val="0"/>
+          <w:sz w:val="20"/>
+        </w:rPr>
+        <w:t>Sign in as a Client (a buyer or seller invited to a transaction) and open Documents from the sidebar. Confirm a real list of documents shared with you appears (not a stub or count-only summary).</w:t>
+      </w:r>
+    </w:p>
+    <w:p>
+      <w:pPr>
+        <w:spacing w:after="40"/>
+        <w:ind w:left="425" w:hanging="255"/>
+      </w:pPr>
+      <w:r>
+        <w:rPr>
+          <w:b w:val="0"/>
+          <w:sz w:val="20"/>
+        </w:rPr>
+        <w:t xml:space="preserve">-  </w:t>
+      </w:r>
+      <w:r>
+        <w:rPr>
+          <w:b w:val="0"/>
+          <w:sz w:val="20"/>
+        </w:rPr>
+        <w:t>Sign in as an FSBO Customer and open Documents from the sidebar. Confirm the same kind of real list appears.</w:t>
+      </w:r>
+    </w:p>
+    <w:p>
+      <w:pPr>
+        <w:spacing w:after="40"/>
+        <w:ind w:left="425" w:hanging="255"/>
+      </w:pPr>
+      <w:r>
+        <w:rPr>
+          <w:b w:val="0"/>
+          <w:sz w:val="20"/>
+        </w:rPr>
+        <w:t xml:space="preserve">-  </w:t>
+      </w:r>
+      <w:r>
+        <w:rPr>
+          <w:b w:val="0"/>
+          <w:sz w:val="20"/>
+        </w:rPr>
+        <w:t>Confirm each row shows the document name, the upload date, and the document type. If a document is already flagged, a small 'Flagged' badge appears next to its name.</w:t>
+      </w:r>
+    </w:p>
+    <w:p>
+      <w:pPr>
+        <w:spacing w:after="40"/>
+        <w:ind w:left="425" w:hanging="255"/>
+      </w:pPr>
+      <w:r>
+        <w:rPr>
+          <w:b w:val="0"/>
+          <w:sz w:val="20"/>
+        </w:rPr>
+        <w:t xml:space="preserve">-  </w:t>
+      </w:r>
+      <w:r>
+        <w:rPr>
+          <w:b w:val="0"/>
+          <w:sz w:val="20"/>
+        </w:rPr>
+        <w:t>On a row that is not yet flagged, click the Flag for deletion button on the right edge of the row. Fill in the reason field and submit.</w:t>
+      </w:r>
+    </w:p>
+    <w:p>
+      <w:pPr>
+        <w:spacing w:after="40"/>
+        <w:ind w:left="425" w:hanging="255"/>
+      </w:pPr>
+      <w:r>
+        <w:rPr>
+          <w:b w:val="0"/>
+          <w:sz w:val="20"/>
+        </w:rPr>
+        <w:t xml:space="preserve">-  </w:t>
+      </w:r>
+      <w:r>
+        <w:rPr>
+          <w:b w:val="0"/>
+          <w:sz w:val="20"/>
+        </w:rPr>
+        <w:t>Confirm the row now shows a 'Flagged' badge and the Flag for deletion button is no longer offered for that row.</w:t>
+      </w:r>
+    </w:p>
+    <w:p>
+      <w:pPr>
+        <w:spacing w:after="40"/>
+        <w:ind w:left="425" w:hanging="255"/>
+      </w:pPr>
+      <w:r>
+        <w:rPr>
+          <w:b w:val="0"/>
+          <w:sz w:val="20"/>
+        </w:rPr>
+        <w:t xml:space="preserve">-  </w:t>
+      </w:r>
+      <w:r>
+        <w:rPr>
+          <w:b w:val="0"/>
+          <w:sz w:val="20"/>
+        </w:rPr>
+        <w:t>Sign in as the Agent or Team Lead for that transaction. Confirm the document now appears on the Deletion Queue (test 27.11) and as a 'Review deletion request' item in the AI Priority list.</w:t>
+      </w:r>
+    </w:p>
+    <w:p>
+      <w:pPr>
+        <w:spacing w:after="40"/>
+        <w:ind w:left="425" w:hanging="255"/>
+      </w:pPr>
+      <w:r>
+        <w:rPr>
+          <w:b w:val="0"/>
+          <w:sz w:val="20"/>
+        </w:rPr>
+        <w:t xml:space="preserve">-  </w:t>
+      </w:r>
+      <w:r>
+        <w:rPr>
+          <w:b w:val="0"/>
+          <w:sz w:val="20"/>
+        </w:rPr>
+        <w:t>After the agent approves or rejects, sign back in as the original requester. Confirm a notification appears in the bell and an email is in your inbox with the decision and any reviewer note.</w:t>
+      </w:r>
+    </w:p>
+    <w:p>
+      <w:pPr>
+        <w:spacing w:before="200" w:after="60"/>
+      </w:pPr>
+      <w:r>
+        <w:rPr>
+          <w:b/>
+          <w:color w:val="1F3A5F"/>
+          <w:sz w:val="22"/>
+        </w:rPr>
+        <w:t>Expected Result</w:t>
+      </w:r>
+    </w:p>
+    <w:p>
+      <w:pPr>
+        <w:spacing w:after="40"/>
+        <w:ind w:left="425" w:hanging="255"/>
+      </w:pPr>
+      <w:r>
+        <w:rPr>
+          <w:b w:val="0"/>
+          <w:sz w:val="20"/>
+        </w:rPr>
+        <w:t xml:space="preserve">-  </w:t>
+      </w:r>
+      <w:r>
+        <w:rPr>
+          <w:b w:val="0"/>
+          <w:sz w:val="20"/>
+        </w:rPr>
+        <w:t>Client and FSBO users see a real document list, not a placeholder.</w:t>
+      </w:r>
+    </w:p>
+    <w:p>
+      <w:pPr>
+        <w:spacing w:after="40"/>
+        <w:ind w:left="425" w:hanging="255"/>
+      </w:pPr>
+      <w:r>
+        <w:rPr>
+          <w:b w:val="0"/>
+          <w:sz w:val="20"/>
+        </w:rPr>
+        <w:t xml:space="preserve">-  </w:t>
+      </w:r>
+      <w:r>
+        <w:rPr>
+          <w:b w:val="0"/>
+          <w:sz w:val="20"/>
+        </w:rPr>
+        <w:t>Anyone outside the agent team can flag a document for deletion, and the agent always hears about it through the queue.</w:t>
+      </w:r>
+    </w:p>
+    <w:p>
+      <w:pPr>
+        <w:spacing w:after="40"/>
+        <w:ind w:left="425" w:hanging="255"/>
+      </w:pPr>
+      <w:r>
+        <w:rPr>
+          <w:b w:val="0"/>
+          <w:sz w:val="20"/>
+        </w:rPr>
+        <w:t xml:space="preserve">-  </w:t>
+      </w:r>
+      <w:r>
+        <w:rPr>
+          <w:b w:val="0"/>
+          <w:sz w:val="20"/>
+        </w:rPr>
+        <w:t>Once flagged, the row shows a Flagged badge so the requester does not flag the same document twice.</w:t>
+      </w:r>
+    </w:p>
+    <w:p>
+      <w:pPr>
+        <w:spacing w:after="40"/>
+        <w:ind w:left="425" w:hanging="255"/>
+      </w:pPr>
+      <w:r>
+        <w:rPr>
+          <w:b w:val="0"/>
+          <w:sz w:val="20"/>
+        </w:rPr>
+        <w:t xml:space="preserve">-  </w:t>
+      </w:r>
+      <w:r>
+        <w:rPr>
+          <w:b w:val="0"/>
+          <w:sz w:val="20"/>
+        </w:rPr>
+        <w:t>The requester always hears back about the decision — through both the in-app bell and email.</w:t>
+      </w:r>
+    </w:p>
+    <w:p>
+      <w:pPr>
+        <w:spacing w:before="200" w:after="60"/>
+      </w:pPr>
+      <w:r>
+        <w:rPr>
+          <w:b/>
+          <w:color w:val="1F3A5F"/>
+          <w:sz w:val="22"/>
+        </w:rPr>
+        <w:t>Future Improvement Suggestions</w:t>
+      </w:r>
+    </w:p>
+    <w:p>
+      <w:pPr>
+        <w:spacing w:after="40"/>
+        <w:ind w:left="425" w:hanging="255"/>
+      </w:pPr>
+      <w:r>
+        <w:rPr>
+          <w:b w:val="0"/>
+          <w:sz w:val="20"/>
+        </w:rPr>
+        <w:t xml:space="preserve">-  </w:t>
+      </w:r>
+      <w:r>
+        <w:rPr>
+          <w:b w:val="0"/>
+          <w:sz w:val="20"/>
+        </w:rPr>
+        <w:t>Add an inline preview of each document so the requester can re-read it before flagging.</w:t>
+      </w:r>
+    </w:p>
+    <w:p>
+      <w:pPr>
+        <w:spacing w:after="40"/>
+        <w:ind w:left="425" w:hanging="255"/>
+      </w:pPr>
+      <w:r>
+        <w:rPr>
+          <w:b w:val="0"/>
+          <w:sz w:val="20"/>
+        </w:rPr>
+        <w:t xml:space="preserve">-  </w:t>
+      </w:r>
+      <w:r>
+        <w:rPr>
+          <w:b w:val="0"/>
+          <w:sz w:val="20"/>
+        </w:rPr>
+        <w:t>Show which transaction each document belongs to (currently only the date and type are shown).</w:t>
+      </w:r>
+    </w:p>
+    <w:p>
+      <w:pPr>
+        <w:spacing w:after="40"/>
+        <w:ind w:left="425" w:hanging="255"/>
+      </w:pPr>
+      <w:r>
+        <w:rPr>
+          <w:b w:val="0"/>
+          <w:sz w:val="20"/>
+        </w:rPr>
+        <w:t xml:space="preserve">-  </w:t>
+      </w:r>
+      <w:r>
+        <w:rPr>
+          <w:b w:val="0"/>
+          <w:sz w:val="20"/>
+        </w:rPr>
+        <w:t>Allow the requester to attach a short note when their reason needs more than one line.</w:t>
+      </w:r>
+    </w:p>
+    <w:p>
+      <w:pPr>
+        <w:spacing w:after="40"/>
+        <w:ind w:left="425" w:hanging="255"/>
+      </w:pPr>
+      <w:r>
+        <w:rPr>
+          <w:b w:val="0"/>
+          <w:sz w:val="20"/>
+        </w:rPr>
+        <w:t xml:space="preserve">-  </w:t>
+      </w:r>
+      <w:r>
+        <w:rPr>
+          <w:b w:val="0"/>
+          <w:sz w:val="20"/>
+        </w:rPr>
+        <w:t>Show the same list to Vendors on the vendor portal once that surface is ready.</w:t>
       </w:r>
     </w:p>
     <w:p>

</xml_diff>